<commit_message>
time for n=80 mistake
</commit_message>
<xml_diff>
--- a/Practica3 2024.eng/ws(home)/mulet_alonso_sergio_3/src/algstudent/s3/lab3.UO296503.docx
+++ b/Practica3 2024.eng/ws(home)/mulet_alonso_sergio_3/src/algstudent/s3/lab3.UO296503.docx
@@ -251,7 +251,39 @@
       </w:pPr>
       <w:r>
         <w:rPr/>
-        <w:t xml:space="preserve">In both we are getting the error </w:t>
+        <w:t xml:space="preserve">In </w:t>
+      </w:r>
+      <w:r>
+        <w:rPr/>
+        <w:t>both</w:t>
+      </w:r>
+      <w:r>
+        <w:rPr/>
+        <w:t xml:space="preserve"> </w:t>
+      </w:r>
+      <w:r>
+        <w:rPr/>
+        <w:t>we</w:t>
+      </w:r>
+      <w:r>
+        <w:rPr/>
+        <w:t xml:space="preserve"> are </w:t>
+      </w:r>
+      <w:r>
+        <w:rPr/>
+        <w:t>getting</w:t>
+      </w:r>
+      <w:r>
+        <w:rPr/>
+        <w:t xml:space="preserve"> </w:t>
+      </w:r>
+      <w:r>
+        <w:rPr/>
+        <w:t>the</w:t>
+      </w:r>
+      <w:r>
+        <w:rPr/>
+        <w:t xml:space="preserve"> error </w:t>
       </w:r>
       <w:r>
         <w:rPr/>
@@ -259,7 +291,55 @@
       </w:r>
       <w:r>
         <w:rPr/>
-        <w:t xml:space="preserve"> and it is not caused by a too </w:t>
+        <w:t xml:space="preserve"> and </w:t>
+      </w:r>
+      <w:r>
+        <w:rPr/>
+        <w:t>it</w:t>
+      </w:r>
+      <w:r>
+        <w:rPr/>
+        <w:t xml:space="preserve"> </w:t>
+      </w:r>
+      <w:r>
+        <w:rPr/>
+        <w:t>is</w:t>
+      </w:r>
+      <w:r>
+        <w:rPr/>
+        <w:t xml:space="preserve"> </w:t>
+      </w:r>
+      <w:r>
+        <w:rPr/>
+        <w:t>not</w:t>
+      </w:r>
+      <w:r>
+        <w:rPr/>
+        <w:t xml:space="preserve"> </w:t>
+      </w:r>
+      <w:r>
+        <w:rPr/>
+        <w:t>caused</w:t>
+      </w:r>
+      <w:r>
+        <w:rPr/>
+        <w:t xml:space="preserve"> </w:t>
+      </w:r>
+      <w:r>
+        <w:rPr/>
+        <w:t>by</w:t>
+      </w:r>
+      <w:r>
+        <w:rPr/>
+        <w:t xml:space="preserve"> a </w:t>
+      </w:r>
+      <w:r>
+        <w:rPr/>
+        <w:t>too</w:t>
+      </w:r>
+      <w:r>
+        <w:rPr/>
+        <w:t xml:space="preserve"> </w:t>
       </w:r>
       <w:r>
         <w:rPr/>
@@ -267,15 +347,123 @@
       </w:r>
       <w:r>
         <w:rPr/>
-        <w:t xml:space="preserve"> executing time. </w:t>
-      </w:r>
-      <w:r>
-        <w:rPr/>
-        <w:t>This error is caused because the recu</w:t>
-      </w:r>
-      <w:r>
-        <w:rPr/>
-        <w:t>rsion depth of both algorithms becomes too big.</w:t>
+        <w:t xml:space="preserve"> </w:t>
+      </w:r>
+      <w:r>
+        <w:rPr/>
+        <w:t>executing</w:t>
+      </w:r>
+      <w:r>
+        <w:rPr/>
+        <w:t xml:space="preserve"> time. </w:t>
+      </w:r>
+      <w:r>
+        <w:rPr/>
+        <w:t>This</w:t>
+      </w:r>
+      <w:r>
+        <w:rPr/>
+        <w:t xml:space="preserve"> error </w:t>
+      </w:r>
+      <w:r>
+        <w:rPr/>
+        <w:t>is</w:t>
+      </w:r>
+      <w:r>
+        <w:rPr/>
+        <w:t xml:space="preserve"> </w:t>
+      </w:r>
+      <w:r>
+        <w:rPr/>
+        <w:t>caused</w:t>
+      </w:r>
+      <w:r>
+        <w:rPr/>
+        <w:t xml:space="preserve"> </w:t>
+      </w:r>
+      <w:r>
+        <w:rPr/>
+        <w:t>because</w:t>
+      </w:r>
+      <w:r>
+        <w:rPr/>
+        <w:t xml:space="preserve"> </w:t>
+      </w:r>
+      <w:r>
+        <w:rPr/>
+        <w:t>the</w:t>
+      </w:r>
+      <w:r>
+        <w:rPr/>
+        <w:t xml:space="preserve"> </w:t>
+      </w:r>
+      <w:r>
+        <w:rPr/>
+        <w:t>recu</w:t>
+      </w:r>
+      <w:r>
+        <w:rPr/>
+        <w:t>rsion</w:t>
+      </w:r>
+      <w:r>
+        <w:rPr/>
+        <w:t xml:space="preserve"> </w:t>
+      </w:r>
+      <w:r>
+        <w:rPr/>
+        <w:t>depth</w:t>
+      </w:r>
+      <w:r>
+        <w:rPr/>
+        <w:t xml:space="preserve"> </w:t>
+      </w:r>
+      <w:r>
+        <w:rPr/>
+        <w:t>of</w:t>
+      </w:r>
+      <w:r>
+        <w:rPr/>
+        <w:t xml:space="preserve"> </w:t>
+      </w:r>
+      <w:r>
+        <w:rPr/>
+        <w:t>both</w:t>
+      </w:r>
+      <w:r>
+        <w:rPr/>
+        <w:t xml:space="preserve"> </w:t>
+      </w:r>
+      <w:r>
+        <w:rPr/>
+        <w:t>algorithms</w:t>
+      </w:r>
+      <w:r>
+        <w:rPr/>
+        <w:t xml:space="preserve"> </w:t>
+      </w:r>
+      <w:r>
+        <w:rPr/>
+        <w:t>becomes</w:t>
+      </w:r>
+      <w:r>
+        <w:rPr/>
+        <w:t xml:space="preserve"> </w:t>
+      </w:r>
+      <w:r>
+        <w:rPr/>
+        <w:t>too</w:t>
+      </w:r>
+      <w:r>
+        <w:rPr/>
+        <w:t xml:space="preserve"> </w:t>
+      </w:r>
+      <w:r>
+        <w:rPr/>
+        <w:t>big</w:t>
+      </w:r>
+      <w:r>
+        <w:rPr/>
+        <w:t>.</w:t>
       </w:r>
     </w:p>
     <w:p>
@@ -287,44 +475,183 @@
       </w:pPr>
       <w:r>
         <w:rPr/>
-        <w:t xml:space="preserve">To calculate how many years will take to execute Substraction3 with n = 80: </w:t>
+        <w:t>To</w:t>
+      </w:r>
+      <w:r>
+        <w:rPr/>
+        <w:t xml:space="preserve"> </w:t>
+      </w:r>
+      <w:r>
+        <w:rPr/>
+        <w:t>calculate</w:t>
+      </w:r>
+      <w:r>
+        <w:rPr/>
+        <w:t xml:space="preserve"> </w:t>
+      </w:r>
+      <w:r>
+        <w:rPr/>
+        <w:t>how</w:t>
+      </w:r>
+      <w:r>
+        <w:rPr/>
+        <w:t xml:space="preserve"> </w:t>
+      </w:r>
+      <w:r>
+        <w:rPr/>
+        <w:t>many</w:t>
+      </w:r>
+      <w:r>
+        <w:rPr/>
+        <w:t xml:space="preserve"> </w:t>
+      </w:r>
+      <w:r>
+        <w:rPr/>
+        <w:t>years</w:t>
+      </w:r>
+      <w:r>
+        <w:rPr/>
+        <w:t xml:space="preserve"> </w:t>
+      </w:r>
+      <w:r>
+        <w:rPr/>
+        <w:t>will</w:t>
+      </w:r>
+      <w:r>
+        <w:rPr/>
+        <w:t xml:space="preserve"> </w:t>
+      </w:r>
+      <w:r>
+        <w:rPr/>
+        <w:t>take</w:t>
+      </w:r>
+      <w:r>
+        <w:rPr/>
+        <w:t xml:space="preserve"> </w:t>
+      </w:r>
+      <w:r>
+        <w:rPr/>
+        <w:t>to</w:t>
+      </w:r>
+      <w:r>
+        <w:rPr/>
+        <w:t xml:space="preserve"> </w:t>
+      </w:r>
+      <w:r>
+        <w:rPr/>
+        <w:t>execute</w:t>
+      </w:r>
+      <w:r>
+        <w:rPr/>
+        <w:t xml:space="preserve"> Substraction3 </w:t>
+      </w:r>
+      <w:r>
+        <w:rPr/>
+        <w:t>with</w:t>
+      </w:r>
+      <w:r>
+        <w:rPr/>
+        <w:t xml:space="preserve"> n = 80: </w:t>
       </w:r>
     </w:p>
     <w:p>
       <w:pPr>
         <w:pStyle w:val="Normal"/>
-        <w:rPr>
-          <w:vertAlign w:val="baseline"/>
-          <w:lang w:val="en-US"/>
-        </w:rPr>
-      </w:pPr>
-      <w:r>
-        <w:rPr/>
-        <w:t>O(2</w:t>
+        <w:rPr/>
+      </w:pPr>
+      <w:r>
+        <w:rPr/>
+        <w:t>Let's</w:t>
+      </w:r>
+      <w:r>
+        <w:rPr/>
+        <w:t xml:space="preserve"> </w:t>
+      </w:r>
+      <w:r>
+        <w:rPr/>
+        <w:t>take</w:t>
+      </w:r>
+      <w:r>
+        <w:rPr/>
+        <w:t xml:space="preserve"> n1 as </w:t>
+      </w:r>
+      <w:r>
+        <w:rPr/>
+        <w:t xml:space="preserve">16 so t1 </w:t>
+      </w:r>
+      <w:r>
+        <w:rPr/>
+        <w:t>is</w:t>
+      </w:r>
+      <w:r>
+        <w:rPr/>
+        <w:t xml:space="preserve"> 2833ms </w:t>
+      </w:r>
+      <w:r>
+        <w:rPr/>
+        <w:t>according</w:t>
+      </w:r>
+      <w:r>
+        <w:rPr/>
+        <w:t xml:space="preserve"> </w:t>
+      </w:r>
+      <w:r>
+        <w:rPr/>
+        <w:t>to</w:t>
+      </w:r>
+      <w:r>
+        <w:rPr/>
+        <w:t xml:space="preserve"> </w:t>
+      </w:r>
+      <w:r>
+        <w:rPr/>
+        <w:t>my</w:t>
+      </w:r>
+      <w:r>
+        <w:rPr/>
+        <w:t xml:space="preserve"> </w:t>
+      </w:r>
+      <w:r>
+        <w:rPr/>
+        <w:t>measurements</w:t>
+      </w:r>
+      <w:r>
+        <w:rPr/>
+        <w:t xml:space="preserve">. </w:t>
+      </w:r>
+    </w:p>
+    <w:p>
+      <w:pPr>
+        <w:pStyle w:val="Normal"/>
+        <w:rPr/>
+      </w:pPr>
+      <w:r>
+        <w:rPr/>
+        <w:t>Then n2 = 80 so K = 80/16 = 5</w:t>
+      </w:r>
+    </w:p>
+    <w:p>
+      <w:pPr>
+        <w:pStyle w:val="Normal"/>
+        <w:rPr/>
+      </w:pPr>
+      <w:r>
+        <w:rPr/>
+        <w:t>f</w:t>
+      </w:r>
+      <w:r>
+        <w:rPr/>
+        <w:t>(n1) = 2</w:t>
       </w:r>
       <w:r>
         <w:rPr>
           <w:vertAlign w:val="superscript"/>
         </w:rPr>
-        <w:t>n</w:t>
-      </w:r>
-      <w:r>
-        <w:rPr>
-          <w:vertAlign w:val="baseline"/>
-        </w:rPr>
-        <w:t xml:space="preserve">) = </w:t>
-      </w:r>
-      <w:r>
-        <w:rPr>
-          <w:vertAlign w:val="baseline"/>
-        </w:rPr>
-        <w:t>O(</w:t>
-      </w:r>
-      <w:r>
-        <w:rPr>
-          <w:vertAlign w:val="baseline"/>
-        </w:rPr>
-        <w:t>2</w:t>
+        <w:t>16</w:t>
+      </w:r>
+      <w:r>
+        <w:rPr/>
+        <w:t xml:space="preserve"> and f(n2) = 2</w:t>
       </w:r>
       <w:r>
         <w:rPr>
@@ -332,35 +659,113 @@
         </w:rPr>
         <w:t>80</w:t>
       </w:r>
-      <w:r>
+    </w:p>
+    <w:p>
+      <w:pPr>
+        <w:pStyle w:val="Normal"/>
+        <w:rPr/>
+      </w:pPr>
+      <w:r>
+        <w:rPr/>
+        <w:t>t2 = n2/n1</w:t>
+      </w:r>
+      <w:r>
+        <w:rPr/>
+        <w:t xml:space="preserve"> * f(n2)/f(n1)</w:t>
+      </w:r>
+      <w:r>
+        <w:rPr/>
+        <w:t xml:space="preserve"> * t1 --&gt; t2 = k *</w:t>
+      </w:r>
+      <w:r>
+        <w:rPr/>
+        <w:t xml:space="preserve"> f(n2)/f(n1)</w:t>
+      </w:r>
+      <w:r>
+        <w:rPr/>
+        <w:t xml:space="preserve"> </w:t>
+      </w:r>
+      <w:r>
+        <w:rPr/>
+        <w:t xml:space="preserve">* </w:t>
+      </w:r>
+      <w:r>
+        <w:rPr/>
+        <w:t xml:space="preserve">t1 --&gt; </w:t>
+      </w:r>
+    </w:p>
+    <w:p>
+      <w:pPr>
+        <w:pStyle w:val="Normal"/>
         <w:rPr>
           <w:vertAlign w:val="baseline"/>
         </w:rPr>
-        <w:t xml:space="preserve">) </w:t>
+      </w:pPr>
+      <w:r>
+        <w:rPr/>
+        <w:t xml:space="preserve">t2 = </w:t>
+      </w:r>
+      <w:r>
+        <w:rPr/>
+        <w:t>5 * 2</w:t>
+      </w:r>
+      <w:r>
+        <w:rPr>
+          <w:vertAlign w:val="superscript"/>
+        </w:rPr>
+        <w:t>80</w:t>
+      </w:r>
+      <w:r>
+        <w:rPr/>
+        <w:t>/2</w:t>
+      </w:r>
+      <w:r>
+        <w:rPr>
+          <w:vertAlign w:val="superscript"/>
+        </w:rPr>
+        <w:t>16</w:t>
       </w:r>
       <w:r>
         <w:rPr>
           <w:vertAlign w:val="baseline"/>
         </w:rPr>
-        <w:t>= 1,208 x 10</w:t>
+        <w:t xml:space="preserve"> * 2833 --&gt; t2 = </w:t>
+      </w:r>
+      <w:r>
+        <w:rPr>
+          <w:vertAlign w:val="baseline"/>
+        </w:rPr>
+        <w:t>2,61298 * 10</w:t>
       </w:r>
       <w:r>
         <w:rPr>
           <w:vertAlign w:val="superscript"/>
         </w:rPr>
-        <w:t>24</w:t>
+        <w:t>23</w:t>
       </w:r>
       <w:r>
         <w:rPr>
           <w:vertAlign w:val="baseline"/>
         </w:rPr>
-        <w:t xml:space="preserve"> milliseconds = 3,829 x 10</w:t>
+        <w:t xml:space="preserve">ms = </w:t>
+      </w:r>
+      <w:r>
+        <w:rPr>
+          <w:vertAlign w:val="baseline"/>
+        </w:rPr>
+        <w:t>8,2857 * 10</w:t>
       </w:r>
       <w:r>
         <w:rPr>
           <w:vertAlign w:val="superscript"/>
         </w:rPr>
-        <w:t xml:space="preserve">13 </w:t>
+        <w:t>12</w:t>
+      </w:r>
+      <w:r>
+        <w:rPr>
+          <w:vertAlign w:val="superscript"/>
+        </w:rPr>
+        <w:t xml:space="preserve"> </w:t>
       </w:r>
       <w:r>
         <w:rPr>
@@ -388,8 +793,8 @@
       </w:r>
       <w:r>
         <w:drawing>
-          <wp:inline wp14:editId="27D714B7" wp14:anchorId="7AE1ADF1">
-            <wp:extent cx="5076427" cy="1616128"/>
+          <wp:inline wp14:editId="0D331393" wp14:anchorId="7AE1ADF1">
+            <wp:extent cx="5076429" cy="1616128"/>
             <wp:effectExtent l="0" t="0" r="0" b="0"/>
             <wp:docPr id="618193686" name="" title=""/>
             <wp:cNvGraphicFramePr>
@@ -403,10 +808,10 @@
                     <pic:cNvPicPr/>
                   </pic:nvPicPr>
                   <pic:blipFill>
-                    <a:blip r:embed="R6e59e1eaa2a54eaf">
-                      <a:extLst>
+                    <a:blip r:embed="Reae36fb91aab44cb">
+                      <a:extLst xmlns:a="http://schemas.openxmlformats.org/drawingml/2006/main">
                         <a:ext xmlns:a="http://schemas.openxmlformats.org/drawingml/2006/main" uri="{28A0092B-C50C-407E-A947-70E740481C1C}">
-                          <a14:useLocalDpi val="0"/>
+                          <a14:useLocalDpi xmlns:a14="http://schemas.microsoft.com/office/drawing/2010/main" val="0"/>
                         </a:ext>
                       </a:extLst>
                     </a:blip>
@@ -415,9 +820,9 @@
                     </a:stretch>
                   </pic:blipFill>
                   <pic:spPr>
-                    <a:xfrm>
+                    <a:xfrm rot="0" flipH="0" flipV="0">
                       <a:off x="0" y="0"/>
-                      <a:ext cx="5076427" cy="1616128"/>
+                      <a:ext cx="5076429" cy="1616128"/>
                     </a:xfrm>
                     <a:prstGeom prst="rect">
                       <a:avLst/>
@@ -443,7 +848,83 @@
       </w:pPr>
       <w:r>
         <w:rPr/>
-        <w:t>To calculate how many years will take to execute Substraction5 with n = 80:</w:t>
+        <w:t>To</w:t>
+      </w:r>
+      <w:r>
+        <w:rPr/>
+        <w:t xml:space="preserve"> </w:t>
+      </w:r>
+      <w:r>
+        <w:rPr/>
+        <w:t>calculate</w:t>
+      </w:r>
+      <w:r>
+        <w:rPr/>
+        <w:t xml:space="preserve"> </w:t>
+      </w:r>
+      <w:r>
+        <w:rPr/>
+        <w:t>how</w:t>
+      </w:r>
+      <w:r>
+        <w:rPr/>
+        <w:t xml:space="preserve"> </w:t>
+      </w:r>
+      <w:r>
+        <w:rPr/>
+        <w:t>many</w:t>
+      </w:r>
+      <w:r>
+        <w:rPr/>
+        <w:t xml:space="preserve"> </w:t>
+      </w:r>
+      <w:r>
+        <w:rPr/>
+        <w:t>years</w:t>
+      </w:r>
+      <w:r>
+        <w:rPr/>
+        <w:t xml:space="preserve"> </w:t>
+      </w:r>
+      <w:r>
+        <w:rPr/>
+        <w:t>will</w:t>
+      </w:r>
+      <w:r>
+        <w:rPr/>
+        <w:t xml:space="preserve"> </w:t>
+      </w:r>
+      <w:r>
+        <w:rPr/>
+        <w:t>take</w:t>
+      </w:r>
+      <w:r>
+        <w:rPr/>
+        <w:t xml:space="preserve"> </w:t>
+      </w:r>
+      <w:r>
+        <w:rPr/>
+        <w:t>to</w:t>
+      </w:r>
+      <w:r>
+        <w:rPr/>
+        <w:t xml:space="preserve"> </w:t>
+      </w:r>
+      <w:r>
+        <w:rPr/>
+        <w:t>execute</w:t>
+      </w:r>
+      <w:r>
+        <w:rPr/>
+        <w:t xml:space="preserve"> Substraction5 </w:t>
+      </w:r>
+      <w:r>
+        <w:rPr/>
+        <w:t>with</w:t>
+      </w:r>
+      <w:r>
+        <w:rPr/>
+        <w:t xml:space="preserve"> n = 80:</w:t>
       </w:r>
     </w:p>
     <w:p>
@@ -453,25 +934,57 @@
       </w:pPr>
       <w:r>
         <w:rPr/>
-        <w:t>O(3</w:t>
+        <w:t xml:space="preserve">We take n1 as 32 and t1 as 1381 as the measurements. </w:t>
+      </w:r>
+    </w:p>
+    <w:p>
+      <w:pPr>
+        <w:pStyle w:val="Normal"/>
+        <w:rPr/>
+      </w:pPr>
+      <w:r>
+        <w:rPr/>
+        <w:t>n2 = 80 so K = 80/32 = 2,5</w:t>
+      </w:r>
+    </w:p>
+    <w:p>
+      <w:pPr>
+        <w:pStyle w:val="Normal"/>
+        <w:rPr>
+          <w:vertAlign w:val="baseline"/>
+        </w:rPr>
+      </w:pPr>
+      <w:r>
+        <w:rPr/>
+        <w:t>f</w:t>
+      </w:r>
+      <w:r>
+        <w:rPr/>
+        <w:t>(n1) = 3</w:t>
       </w:r>
       <w:r>
         <w:rPr>
           <w:vertAlign w:val="superscript"/>
         </w:rPr>
-        <w:t>n/2</w:t>
-      </w:r>
-      <w:r>
-        <w:rPr/>
-        <w:t xml:space="preserve">) = </w:t>
-      </w:r>
-      <w:r>
-        <w:rPr/>
-        <w:t>O(</w:t>
-      </w:r>
-      <w:r>
-        <w:rPr/>
-        <w:t>3</w:t>
+        <w:t xml:space="preserve">32/2 </w:t>
+      </w:r>
+      <w:r>
+        <w:rPr>
+          <w:vertAlign w:val="baseline"/>
+        </w:rPr>
+        <w:t>= 3</w:t>
+      </w:r>
+      <w:r>
+        <w:rPr>
+          <w:vertAlign w:val="superscript"/>
+        </w:rPr>
+        <w:t xml:space="preserve">16 </w:t>
+      </w:r>
+      <w:r>
+        <w:rPr>
+          <w:vertAlign w:val="baseline"/>
+        </w:rPr>
+        <w:t>and f(n2) = 3</w:t>
       </w:r>
       <w:r>
         <w:rPr>
@@ -480,16 +993,10 @@
         <w:t>80/2</w:t>
       </w:r>
       <w:r>
-        <w:rPr/>
-        <w:t xml:space="preserve">) = </w:t>
-      </w:r>
-      <w:r>
-        <w:rPr/>
-        <w:t>O(</w:t>
-      </w:r>
-      <w:r>
-        <w:rPr/>
-        <w:t>3</w:t>
+        <w:rPr>
+          <w:vertAlign w:val="baseline"/>
+        </w:rPr>
+        <w:t xml:space="preserve"> = 3</w:t>
       </w:r>
       <w:r>
         <w:rPr>
@@ -497,44 +1004,84 @@
         </w:rPr>
         <w:t>40</w:t>
       </w:r>
-      <w:r>
-        <w:rPr/>
-        <w:t>) = 1,2</w:t>
-      </w:r>
-      <w:r>
-        <w:rPr/>
-        <w:t>1577 x 10</w:t>
+    </w:p>
+    <w:p>
+      <w:pPr>
+        <w:pStyle w:val="Normal"/>
+        <w:rPr/>
+      </w:pPr>
+      <w:r>
+        <w:rPr>
+          <w:vertAlign w:val="baseline"/>
+        </w:rPr>
+        <w:t>t2 = n2/n1 * f(n2)/f(n1) * t1 --&gt; t2 = k * f(n2)/f(n1) * t1 --&gt; t2 = 2,5 * 3</w:t>
       </w:r>
       <w:r>
         <w:rPr>
           <w:vertAlign w:val="superscript"/>
         </w:rPr>
-        <w:t>19</w:t>
-      </w:r>
-      <w:r>
-        <w:rPr/>
-        <w:t xml:space="preserve"> </w:t>
+        <w:t>40</w:t>
       </w:r>
       <w:r>
         <w:rPr>
           <w:vertAlign w:val="baseline"/>
         </w:rPr>
-        <w:t>milliseconds</w:t>
-      </w:r>
-      <w:r>
-        <w:rPr/>
-        <w:t xml:space="preserve"> = </w:t>
-      </w:r>
-      <w:r>
-        <w:rPr/>
-        <w:t xml:space="preserve">385517041 </w:t>
-      </w:r>
-      <w:r>
-        <w:rPr/>
-        <w:t>years</w:t>
-      </w:r>
-      <w:r>
-        <w:rPr/>
+        <w:t>/3</w:t>
+      </w:r>
+      <w:r>
+        <w:rPr>
+          <w:vertAlign w:val="superscript"/>
+        </w:rPr>
+        <w:t>16</w:t>
+      </w:r>
+      <w:r>
+        <w:rPr>
+          <w:vertAlign w:val="baseline"/>
+        </w:rPr>
+        <w:t xml:space="preserve"> * 1381 --&gt;</w:t>
+      </w:r>
+    </w:p>
+    <w:p>
+      <w:pPr>
+        <w:pStyle w:val="Normal"/>
+        <w:rPr>
+          <w:vertAlign w:val="baseline"/>
+        </w:rPr>
+      </w:pPr>
+      <w:r>
+        <w:rPr>
+          <w:vertAlign w:val="baseline"/>
+        </w:rPr>
+        <w:t xml:space="preserve">--&gt; t2 = </w:t>
+      </w:r>
+      <w:r>
+        <w:rPr>
+          <w:vertAlign w:val="baseline"/>
+        </w:rPr>
+        <w:t>9,75088 * 10</w:t>
+      </w:r>
+      <w:r>
+        <w:rPr>
+          <w:vertAlign w:val="superscript"/>
+        </w:rPr>
+        <w:t xml:space="preserve">14 </w:t>
+      </w:r>
+      <w:r>
+        <w:rPr>
+          <w:vertAlign w:val="baseline"/>
+        </w:rPr>
+        <w:t>ms</w:t>
+      </w:r>
+      <w:r>
+        <w:rPr>
+          <w:vertAlign w:val="baseline"/>
+        </w:rPr>
+        <w:t xml:space="preserve"> = 30919,83684 years</w:t>
+      </w:r>
+      <w:r>
+        <w:rPr>
+          <w:vertAlign w:val="baseline"/>
+        </w:rPr>
         <w:t>.</w:t>
       </w:r>
     </w:p>
@@ -594,7 +1141,67 @@
       </w:pPr>
       <w:r>
         <w:rPr/>
-        <w:t xml:space="preserve">The fastest algorithm is Division1, which makes sense since </w:t>
+        <w:t>The</w:t>
+      </w:r>
+      <w:r>
+        <w:rPr/>
+        <w:t xml:space="preserve"> </w:t>
+      </w:r>
+      <w:r>
+        <w:rPr/>
+        <w:t>fastest</w:t>
+      </w:r>
+      <w:r>
+        <w:rPr/>
+        <w:t xml:space="preserve"> </w:t>
+      </w:r>
+      <w:r>
+        <w:rPr/>
+        <w:t>algorithm</w:t>
+      </w:r>
+      <w:r>
+        <w:rPr/>
+        <w:t xml:space="preserve"> </w:t>
+      </w:r>
+      <w:r>
+        <w:rPr/>
+        <w:t>is</w:t>
+      </w:r>
+      <w:r>
+        <w:rPr/>
+        <w:t xml:space="preserve"> Division1, </w:t>
+      </w:r>
+      <w:r>
+        <w:rPr/>
+        <w:t>which</w:t>
+      </w:r>
+      <w:r>
+        <w:rPr/>
+        <w:t xml:space="preserve"> </w:t>
+      </w:r>
+      <w:r>
+        <w:rPr/>
+        <w:t>makes</w:t>
+      </w:r>
+      <w:r>
+        <w:rPr/>
+        <w:t xml:space="preserve"> </w:t>
+      </w:r>
+      <w:r>
+        <w:rPr/>
+        <w:t>sense</w:t>
+      </w:r>
+      <w:r>
+        <w:rPr/>
+        <w:t xml:space="preserve"> </w:t>
+      </w:r>
+      <w:r>
+        <w:rPr/>
+        <w:t>since</w:t>
+      </w:r>
+      <w:r>
+        <w:rPr/>
+        <w:t xml:space="preserve"> </w:t>
       </w:r>
       <w:r>
         <w:rPr/>
@@ -602,7 +1209,23 @@
       </w:r>
       <w:r>
         <w:rPr/>
-        <w:t xml:space="preserve"> complexity is O(n).</w:t>
+        <w:t xml:space="preserve"> </w:t>
+      </w:r>
+      <w:r>
+        <w:rPr/>
+        <w:t>complexity</w:t>
+      </w:r>
+      <w:r>
+        <w:rPr/>
+        <w:t xml:space="preserve"> </w:t>
+      </w:r>
+      <w:r>
+        <w:rPr/>
+        <w:t>is</w:t>
+      </w:r>
+      <w:r>
+        <w:rPr/>
+        <w:t xml:space="preserve"> O(n).</w:t>
       </w:r>
     </w:p>
     <w:p>
@@ -614,7 +1237,15 @@
       </w:pPr>
       <w:r>
         <w:rPr/>
-        <w:t>As Division2 has a complexity O(</w:t>
+        <w:t xml:space="preserve">As Division2 has a </w:t>
+      </w:r>
+      <w:r>
+        <w:rPr/>
+        <w:t>complexity</w:t>
+      </w:r>
+      <w:r>
+        <w:rPr/>
+        <w:t xml:space="preserve"> O(</w:t>
       </w:r>
       <w:r>
         <w:rPr/>
@@ -622,15 +1253,251 @@
       </w:r>
       <w:r>
         <w:rPr/>
-        <w:t>) is the slowest one. The difference between D</w:t>
-      </w:r>
-      <w:r>
-        <w:rPr/>
-        <w:t xml:space="preserve">ivision1 and Division3 is that, despite having the same complexity, </w:t>
-      </w:r>
-      <w:r>
-        <w:rPr/>
-        <w:t>Division 1 divides the size problem by 3 and Division3 by 2 so with the same size problems and same repetitions, Division1 will always be faster.</w:t>
+        <w:t xml:space="preserve">) </w:t>
+      </w:r>
+      <w:r>
+        <w:rPr/>
+        <w:t>is</w:t>
+      </w:r>
+      <w:r>
+        <w:rPr/>
+        <w:t xml:space="preserve"> </w:t>
+      </w:r>
+      <w:r>
+        <w:rPr/>
+        <w:t>the</w:t>
+      </w:r>
+      <w:r>
+        <w:rPr/>
+        <w:t xml:space="preserve"> </w:t>
+      </w:r>
+      <w:r>
+        <w:rPr/>
+        <w:t>slowest</w:t>
+      </w:r>
+      <w:r>
+        <w:rPr/>
+        <w:t xml:space="preserve"> </w:t>
+      </w:r>
+      <w:r>
+        <w:rPr/>
+        <w:t>one</w:t>
+      </w:r>
+      <w:r>
+        <w:rPr/>
+        <w:t xml:space="preserve">. </w:t>
+      </w:r>
+      <w:r>
+        <w:rPr/>
+        <w:t>The</w:t>
+      </w:r>
+      <w:r>
+        <w:rPr/>
+        <w:t xml:space="preserve"> </w:t>
+      </w:r>
+      <w:r>
+        <w:rPr/>
+        <w:t>difference</w:t>
+      </w:r>
+      <w:r>
+        <w:rPr/>
+        <w:t xml:space="preserve"> </w:t>
+      </w:r>
+      <w:r>
+        <w:rPr/>
+        <w:t>between</w:t>
+      </w:r>
+      <w:r>
+        <w:rPr/>
+        <w:t xml:space="preserve"> D</w:t>
+      </w:r>
+      <w:r>
+        <w:rPr/>
+        <w:t xml:space="preserve">ivision1 and Division3 </w:t>
+      </w:r>
+      <w:r>
+        <w:rPr/>
+        <w:t>is</w:t>
+      </w:r>
+      <w:r>
+        <w:rPr/>
+        <w:t xml:space="preserve"> </w:t>
+      </w:r>
+      <w:r>
+        <w:rPr/>
+        <w:t>that</w:t>
+      </w:r>
+      <w:r>
+        <w:rPr/>
+        <w:t xml:space="preserve">, </w:t>
+      </w:r>
+      <w:r>
+        <w:rPr/>
+        <w:t>despite</w:t>
+      </w:r>
+      <w:r>
+        <w:rPr/>
+        <w:t xml:space="preserve"> </w:t>
+      </w:r>
+      <w:r>
+        <w:rPr/>
+        <w:t>having</w:t>
+      </w:r>
+      <w:r>
+        <w:rPr/>
+        <w:t xml:space="preserve"> </w:t>
+      </w:r>
+      <w:r>
+        <w:rPr/>
+        <w:t>the</w:t>
+      </w:r>
+      <w:r>
+        <w:rPr/>
+        <w:t xml:space="preserve"> </w:t>
+      </w:r>
+      <w:r>
+        <w:rPr/>
+        <w:t>same</w:t>
+      </w:r>
+      <w:r>
+        <w:rPr/>
+        <w:t xml:space="preserve"> </w:t>
+      </w:r>
+      <w:r>
+        <w:rPr/>
+        <w:t>complexity</w:t>
+      </w:r>
+      <w:r>
+        <w:rPr/>
+        <w:t xml:space="preserve">, </w:t>
+      </w:r>
+      <w:r>
+        <w:rPr/>
+        <w:t>Division</w:t>
+      </w:r>
+      <w:r>
+        <w:rPr/>
+        <w:t xml:space="preserve"> 1 divides </w:t>
+      </w:r>
+      <w:r>
+        <w:rPr/>
+        <w:t>the</w:t>
+      </w:r>
+      <w:r>
+        <w:rPr/>
+        <w:t xml:space="preserve"> </w:t>
+      </w:r>
+      <w:r>
+        <w:rPr/>
+        <w:t>size</w:t>
+      </w:r>
+      <w:r>
+        <w:rPr/>
+        <w:t xml:space="preserve"> </w:t>
+      </w:r>
+      <w:r>
+        <w:rPr/>
+        <w:t>problem</w:t>
+      </w:r>
+      <w:r>
+        <w:rPr/>
+        <w:t xml:space="preserve"> </w:t>
+      </w:r>
+      <w:r>
+        <w:rPr/>
+        <w:t>by</w:t>
+      </w:r>
+      <w:r>
+        <w:rPr/>
+        <w:t xml:space="preserve"> 3 and Division3 </w:t>
+      </w:r>
+      <w:r>
+        <w:rPr/>
+        <w:t>by</w:t>
+      </w:r>
+      <w:r>
+        <w:rPr/>
+        <w:t xml:space="preserve"> 2 so </w:t>
+      </w:r>
+      <w:r>
+        <w:rPr/>
+        <w:t>with</w:t>
+      </w:r>
+      <w:r>
+        <w:rPr/>
+        <w:t xml:space="preserve"> </w:t>
+      </w:r>
+      <w:r>
+        <w:rPr/>
+        <w:t>the</w:t>
+      </w:r>
+      <w:r>
+        <w:rPr/>
+        <w:t xml:space="preserve"> </w:t>
+      </w:r>
+      <w:r>
+        <w:rPr/>
+        <w:t>same</w:t>
+      </w:r>
+      <w:r>
+        <w:rPr/>
+        <w:t xml:space="preserve"> </w:t>
+      </w:r>
+      <w:r>
+        <w:rPr/>
+        <w:t>size</w:t>
+      </w:r>
+      <w:r>
+        <w:rPr/>
+        <w:t xml:space="preserve"> </w:t>
+      </w:r>
+      <w:r>
+        <w:rPr/>
+        <w:t>problems</w:t>
+      </w:r>
+      <w:r>
+        <w:rPr/>
+        <w:t xml:space="preserve"> and </w:t>
+      </w:r>
+      <w:r>
+        <w:rPr/>
+        <w:t>same</w:t>
+      </w:r>
+      <w:r>
+        <w:rPr/>
+        <w:t xml:space="preserve"> </w:t>
+      </w:r>
+      <w:r>
+        <w:rPr/>
+        <w:t>repetitions</w:t>
+      </w:r>
+      <w:r>
+        <w:rPr/>
+        <w:t xml:space="preserve">, Division1 </w:t>
+      </w:r>
+      <w:r>
+        <w:rPr/>
+        <w:t>will</w:t>
+      </w:r>
+      <w:r>
+        <w:rPr/>
+        <w:t xml:space="preserve"> </w:t>
+      </w:r>
+      <w:r>
+        <w:rPr/>
+        <w:t>always</w:t>
+      </w:r>
+      <w:r>
+        <w:rPr/>
+        <w:t xml:space="preserve"> be </w:t>
+      </w:r>
+      <w:r>
+        <w:rPr/>
+        <w:t>faster</w:t>
+      </w:r>
+      <w:r>
+        <w:rPr/>
+        <w:t>.</w:t>
       </w:r>
     </w:p>
     <w:p>
@@ -646,8 +1513,8 @@
       </w:pPr>
       <w:r>
         <w:drawing>
-          <wp:inline wp14:editId="27682A12" wp14:anchorId="1B735A2C">
-            <wp:extent cx="5229731" cy="2108267"/>
+          <wp:inline wp14:editId="2B60AE3B" wp14:anchorId="1B735A2C">
+            <wp:extent cx="5229732" cy="2108267"/>
             <wp:effectExtent l="0" t="0" r="0" b="0"/>
             <wp:docPr id="501980562" name="" title=""/>
             <wp:cNvGraphicFramePr>
@@ -661,10 +1528,10 @@
                     <pic:cNvPicPr/>
                   </pic:nvPicPr>
                   <pic:blipFill>
-                    <a:blip r:embed="R25119c57eed841c1">
-                      <a:extLst>
+                    <a:blip r:embed="R9e3fe994fdaf4ef3">
+                      <a:extLst xmlns:a="http://schemas.openxmlformats.org/drawingml/2006/main">
                         <a:ext xmlns:a="http://schemas.openxmlformats.org/drawingml/2006/main" uri="{28A0092B-C50C-407E-A947-70E740481C1C}">
-                          <a14:useLocalDpi val="0"/>
+                          <a14:useLocalDpi xmlns:a14="http://schemas.microsoft.com/office/drawing/2010/main" val="0"/>
                         </a:ext>
                       </a:extLst>
                     </a:blip>
@@ -673,9 +1540,9 @@
                     </a:stretch>
                   </pic:blipFill>
                   <pic:spPr>
-                    <a:xfrm>
+                    <a:xfrm rot="0" flipH="0" flipV="0">
                       <a:off x="0" y="0"/>
-                      <a:ext cx="5229731" cy="2108267"/>
+                      <a:ext cx="5229732" cy="2108267"/>
                     </a:xfrm>
                     <a:prstGeom prst="rect">
                       <a:avLst/>
@@ -701,11 +1568,111 @@
       </w:pPr>
       <w:r>
         <w:rPr/>
-        <w:t>Despite having the same complexity, my Division4 is faster than Division5.</w:t>
-      </w:r>
-      <w:r>
-        <w:rPr/>
-        <w:t xml:space="preserve"> This happens probably because Division4 </w:t>
+        <w:t>Despite</w:t>
+      </w:r>
+      <w:r>
+        <w:rPr/>
+        <w:t xml:space="preserve"> </w:t>
+      </w:r>
+      <w:r>
+        <w:rPr/>
+        <w:t>having</w:t>
+      </w:r>
+      <w:r>
+        <w:rPr/>
+        <w:t xml:space="preserve"> </w:t>
+      </w:r>
+      <w:r>
+        <w:rPr/>
+        <w:t>the</w:t>
+      </w:r>
+      <w:r>
+        <w:rPr/>
+        <w:t xml:space="preserve"> </w:t>
+      </w:r>
+      <w:r>
+        <w:rPr/>
+        <w:t>same</w:t>
+      </w:r>
+      <w:r>
+        <w:rPr/>
+        <w:t xml:space="preserve"> </w:t>
+      </w:r>
+      <w:r>
+        <w:rPr/>
+        <w:t>complexity</w:t>
+      </w:r>
+      <w:r>
+        <w:rPr/>
+        <w:t xml:space="preserve">, </w:t>
+      </w:r>
+      <w:r>
+        <w:rPr/>
+        <w:t>my</w:t>
+      </w:r>
+      <w:r>
+        <w:rPr/>
+        <w:t xml:space="preserve"> Division4 </w:t>
+      </w:r>
+      <w:r>
+        <w:rPr/>
+        <w:t>is</w:t>
+      </w:r>
+      <w:r>
+        <w:rPr/>
+        <w:t xml:space="preserve"> </w:t>
+      </w:r>
+      <w:r>
+        <w:rPr/>
+        <w:t>faster</w:t>
+      </w:r>
+      <w:r>
+        <w:rPr/>
+        <w:t xml:space="preserve"> </w:t>
+      </w:r>
+      <w:r>
+        <w:rPr/>
+        <w:t>than</w:t>
+      </w:r>
+      <w:r>
+        <w:rPr/>
+        <w:t xml:space="preserve"> Division5.</w:t>
+      </w:r>
+      <w:r>
+        <w:rPr/>
+        <w:t xml:space="preserve"> </w:t>
+      </w:r>
+      <w:r>
+        <w:rPr/>
+        <w:t>This</w:t>
+      </w:r>
+      <w:r>
+        <w:rPr/>
+        <w:t xml:space="preserve"> </w:t>
+      </w:r>
+      <w:r>
+        <w:rPr/>
+        <w:t>happens</w:t>
+      </w:r>
+      <w:r>
+        <w:rPr/>
+        <w:t xml:space="preserve"> </w:t>
+      </w:r>
+      <w:r>
+        <w:rPr/>
+        <w:t>probably</w:t>
+      </w:r>
+      <w:r>
+        <w:rPr/>
+        <w:t xml:space="preserve"> </w:t>
+      </w:r>
+      <w:r>
+        <w:rPr/>
+        <w:t>because</w:t>
+      </w:r>
+      <w:r>
+        <w:rPr/>
+        <w:t xml:space="preserve"> Division4 </w:t>
       </w:r>
       <w:r>
         <w:rPr/>
@@ -713,7 +1680,31 @@
       </w:r>
       <w:r>
         <w:rPr/>
-        <w:t xml:space="preserve"> make as many recursive calls as </w:t>
+        <w:t xml:space="preserve"> </w:t>
+      </w:r>
+      <w:r>
+        <w:rPr/>
+        <w:t>make</w:t>
+      </w:r>
+      <w:r>
+        <w:rPr/>
+        <w:t xml:space="preserve"> as </w:t>
+      </w:r>
+      <w:r>
+        <w:rPr/>
+        <w:t>many</w:t>
+      </w:r>
+      <w:r>
+        <w:rPr/>
+        <w:t xml:space="preserve"> recursive </w:t>
+      </w:r>
+      <w:r>
+        <w:rPr/>
+        <w:t>calls</w:t>
+      </w:r>
+      <w:r>
+        <w:rPr/>
+        <w:t xml:space="preserve"> as </w:t>
       </w:r>
       <w:r>
         <w:rPr/>
@@ -735,7 +1726,11 @@
       </w:r>
       <w:r>
         <w:rPr/>
-        <w:t xml:space="preserve"> 3. Basic Examples</w:t>
+        <w:t xml:space="preserve"> 3. Basic </w:t>
+      </w:r>
+      <w:r>
+        <w:rPr/>
+        <w:t>Examples</w:t>
       </w:r>
     </w:p>
     <w:p>
@@ -749,7 +1744,19 @@
       </w:r>
       <w:r>
         <w:rPr/>
-        <w:t xml:space="preserve"> with 100000 as argument</w:t>
+        <w:t xml:space="preserve"> </w:t>
+      </w:r>
+      <w:r>
+        <w:rPr/>
+        <w:t>with</w:t>
+      </w:r>
+      <w:r>
+        <w:rPr/>
+        <w:t xml:space="preserve"> 100000 as </w:t>
+      </w:r>
+      <w:r>
+        <w:rPr/>
+        <w:t>argument</w:t>
       </w:r>
     </w:p>
     <w:p>
@@ -765,7 +1772,7 @@
       </w:pPr>
       <w:r>
         <w:drawing>
-          <wp:inline wp14:editId="74F914EE" wp14:anchorId="7F3664B5">
+          <wp:inline wp14:editId="44F72C99" wp14:anchorId="7F3664B5">
             <wp:extent cx="5581648" cy="2200275"/>
             <wp:effectExtent l="0" t="0" r="0" b="0"/>
             <wp:docPr id="98474843" name="" title=""/>
@@ -780,10 +1787,10 @@
                     <pic:cNvPicPr/>
                   </pic:nvPicPr>
                   <pic:blipFill>
-                    <a:blip r:embed="Rb8ec0f5db7cb4bef">
-                      <a:extLst>
+                    <a:blip r:embed="Ra0dcb5db1ddb48a9">
+                      <a:extLst xmlns:a="http://schemas.openxmlformats.org/drawingml/2006/main">
                         <a:ext xmlns:a="http://schemas.openxmlformats.org/drawingml/2006/main" uri="{28A0092B-C50C-407E-A947-70E740481C1C}">
-                          <a14:useLocalDpi val="0"/>
+                          <a14:useLocalDpi xmlns:a14="http://schemas.microsoft.com/office/drawing/2010/main" val="0"/>
                         </a:ext>
                       </a:extLst>
                     </a:blip>
@@ -792,7 +1799,7 @@
                     </a:stretch>
                   </pic:blipFill>
                   <pic:spPr>
-                    <a:xfrm>
+                    <a:xfrm rot="0" flipH="0" flipV="0">
                       <a:off x="0" y="0"/>
                       <a:ext cx="5581648" cy="2200275"/>
                     </a:xfrm>
@@ -808,7 +1815,47 @@
       </w:r>
       <w:r>
         <w:rPr/>
-        <w:t xml:space="preserve">Sum1 is clearly the best and the </w:t>
+        <w:t xml:space="preserve">Sum1 </w:t>
+      </w:r>
+      <w:r>
+        <w:rPr/>
+        <w:t>is</w:t>
+      </w:r>
+      <w:r>
+        <w:rPr/>
+        <w:t xml:space="preserve"> </w:t>
+      </w:r>
+      <w:r>
+        <w:rPr/>
+        <w:t>clearly</w:t>
+      </w:r>
+      <w:r>
+        <w:rPr/>
+        <w:t xml:space="preserve"> </w:t>
+      </w:r>
+      <w:r>
+        <w:rPr/>
+        <w:t>the</w:t>
+      </w:r>
+      <w:r>
+        <w:rPr/>
+        <w:t xml:space="preserve"> </w:t>
+      </w:r>
+      <w:r>
+        <w:rPr/>
+        <w:t>best</w:t>
+      </w:r>
+      <w:r>
+        <w:rPr/>
+        <w:t xml:space="preserve"> and </w:t>
+      </w:r>
+      <w:r>
+        <w:rPr/>
+        <w:t>the</w:t>
+      </w:r>
+      <w:r>
+        <w:rPr/>
+        <w:t xml:space="preserve"> </w:t>
       </w:r>
       <w:r>
         <w:rPr/>
@@ -816,7 +1863,15 @@
       </w:r>
       <w:r>
         <w:rPr/>
-        <w:t xml:space="preserve"> that </w:t>
+        <w:t xml:space="preserve"> </w:t>
+      </w:r>
+      <w:r>
+        <w:rPr/>
+        <w:t>that</w:t>
+      </w:r>
+      <w:r>
+        <w:rPr/>
+        <w:t xml:space="preserve"> </w:t>
       </w:r>
       <w:r>
         <w:rPr/>
@@ -824,7 +1879,39 @@
       </w:r>
       <w:r>
         <w:rPr/>
-        <w:t xml:space="preserve"> a loop instead of recursion.</w:t>
+        <w:t xml:space="preserve"> a </w:t>
+      </w:r>
+      <w:r>
+        <w:rPr/>
+        <w:t>loop</w:t>
+      </w:r>
+      <w:r>
+        <w:rPr/>
+        <w:t xml:space="preserve"> </w:t>
+      </w:r>
+      <w:r>
+        <w:rPr/>
+        <w:t>instead</w:t>
+      </w:r>
+      <w:r>
+        <w:rPr/>
+        <w:t xml:space="preserve"> </w:t>
+      </w:r>
+      <w:r>
+        <w:rPr/>
+        <w:t>of</w:t>
+      </w:r>
+      <w:r>
+        <w:rPr/>
+        <w:t xml:space="preserve"> </w:t>
+      </w:r>
+      <w:r>
+        <w:rPr/>
+        <w:t>recursion</w:t>
+      </w:r>
+      <w:r>
+        <w:rPr/>
+        <w:t>.</w:t>
       </w:r>
     </w:p>
     <w:p>
@@ -840,7 +1927,11 @@
       </w:pPr>
       <w:r>
         <w:rPr/>
-        <w:t>Fibonacci with</w:t>
+        <w:t xml:space="preserve">Fibonacci </w:t>
+      </w:r>
+      <w:r>
+        <w:rPr/>
+        <w:t>with</w:t>
       </w:r>
       <w:r>
         <w:rPr/>
@@ -848,7 +1939,15 @@
       </w:r>
       <w:r>
         <w:rPr/>
-        <w:t xml:space="preserve"> as argument </w:t>
+        <w:t xml:space="preserve"> as </w:t>
+      </w:r>
+      <w:r>
+        <w:rPr/>
+        <w:t>argument</w:t>
+      </w:r>
+      <w:r>
+        <w:rPr/>
+        <w:t xml:space="preserve"> </w:t>
       </w:r>
     </w:p>
     <w:p>
@@ -859,7 +1958,7 @@
       </w:pPr>
       <w:r>
         <w:drawing>
-          <wp:inline wp14:editId="29C33BEE" wp14:anchorId="12AF2B33">
+          <wp:inline wp14:editId="2ED6B22B" wp14:anchorId="12AF2B33">
             <wp:extent cx="5430114" cy="1427027"/>
             <wp:effectExtent l="0" t="0" r="0" b="0"/>
             <wp:docPr id="1415815847" name="" title=""/>
@@ -874,10 +1973,10 @@
                     <pic:cNvPicPr/>
                   </pic:nvPicPr>
                   <pic:blipFill>
-                    <a:blip r:embed="R57f021caba7d49bb">
-                      <a:extLst>
+                    <a:blip r:embed="Rb385c454f512498b">
+                      <a:extLst xmlns:a="http://schemas.openxmlformats.org/drawingml/2006/main">
                         <a:ext xmlns:a="http://schemas.openxmlformats.org/drawingml/2006/main" uri="{28A0092B-C50C-407E-A947-70E740481C1C}">
-                          <a14:useLocalDpi val="0"/>
+                          <a14:useLocalDpi xmlns:a14="http://schemas.microsoft.com/office/drawing/2010/main" val="0"/>
                         </a:ext>
                       </a:extLst>
                     </a:blip>
@@ -886,7 +1985,7 @@
                     </a:stretch>
                   </pic:blipFill>
                   <pic:spPr>
-                    <a:xfrm>
+                    <a:xfrm rot="0" flipH="0" flipV="0">
                       <a:off x="0" y="0"/>
                       <a:ext cx="5430114" cy="1427027"/>
                     </a:xfrm>
@@ -909,7 +2008,27 @@
       </w:pPr>
       <w:r>
         <w:rPr/>
-        <w:t xml:space="preserve">Clearly, Fibonacci1 and Fibonacci2 are the best </w:t>
+        <w:t>Clearly</w:t>
+      </w:r>
+      <w:r>
+        <w:rPr/>
+        <w:t xml:space="preserve">, Fibonacci1 and Fibonacci2 are </w:t>
+      </w:r>
+      <w:r>
+        <w:rPr/>
+        <w:t>the</w:t>
+      </w:r>
+      <w:r>
+        <w:rPr/>
+        <w:t xml:space="preserve"> </w:t>
+      </w:r>
+      <w:r>
+        <w:rPr/>
+        <w:t>best</w:t>
+      </w:r>
+      <w:r>
+        <w:rPr/>
+        <w:t xml:space="preserve"> </w:t>
       </w:r>
       <w:r>
         <w:rPr/>
@@ -925,7 +2044,39 @@
       </w:r>
       <w:r>
         <w:rPr/>
-        <w:t xml:space="preserve">, the iterative ones. Fib4 has a different complexity </w:t>
+        <w:t xml:space="preserve">, </w:t>
+      </w:r>
+      <w:r>
+        <w:rPr/>
+        <w:t>the</w:t>
+      </w:r>
+      <w:r>
+        <w:rPr/>
+        <w:t xml:space="preserve"> iterative </w:t>
+      </w:r>
+      <w:r>
+        <w:rPr/>
+        <w:t>ones</w:t>
+      </w:r>
+      <w:r>
+        <w:rPr/>
+        <w:t xml:space="preserve">. Fib4 has a </w:t>
+      </w:r>
+      <w:r>
+        <w:rPr/>
+        <w:t>different</w:t>
+      </w:r>
+      <w:r>
+        <w:rPr/>
+        <w:t xml:space="preserve"> </w:t>
+      </w:r>
+      <w:r>
+        <w:rPr/>
+        <w:t>complexity</w:t>
+      </w:r>
+      <w:r>
+        <w:rPr/>
+        <w:t xml:space="preserve"> </w:t>
       </w:r>
       <w:r>
         <w:rPr/>
@@ -963,7 +2114,15 @@
       </w:r>
       <w:r>
         <w:rPr/>
-        <w:t xml:space="preserve"> approach as Fibonacci3.</w:t>
+        <w:t xml:space="preserve"> </w:t>
+      </w:r>
+      <w:r>
+        <w:rPr/>
+        <w:t>approach</w:t>
+      </w:r>
+      <w:r>
+        <w:rPr/>
+        <w:t xml:space="preserve"> as Fibonacci3.</w:t>
       </w:r>
     </w:p>
     <w:p>
@@ -1005,7 +2164,7 @@
       </w:pPr>
       <w:r>
         <w:drawing>
-          <wp:inline wp14:editId="25B83292" wp14:anchorId="5A1241C9">
+          <wp:inline wp14:editId="73C8F7C5" wp14:anchorId="5A1241C9">
             <wp:extent cx="3995912" cy="3006824"/>
             <wp:effectExtent l="0" t="0" r="0" b="0"/>
             <wp:docPr id="1815415299" name="" title=""/>
@@ -1020,10 +2179,10 @@
                     <pic:cNvPicPr/>
                   </pic:nvPicPr>
                   <pic:blipFill>
-                    <a:blip r:embed="Ra5fb2f5c2b8d4b94">
-                      <a:extLst>
+                    <a:blip r:embed="Rf511beaa46754abd">
+                      <a:extLst xmlns:a="http://schemas.openxmlformats.org/drawingml/2006/main">
                         <a:ext xmlns:a="http://schemas.openxmlformats.org/drawingml/2006/main" uri="{28A0092B-C50C-407E-A947-70E740481C1C}">
-                          <a14:useLocalDpi val="0"/>
+                          <a14:useLocalDpi xmlns:a14="http://schemas.microsoft.com/office/drawing/2010/main" val="0"/>
                         </a:ext>
                       </a:extLst>
                     </a:blip>
@@ -1032,7 +2191,7 @@
                     </a:stretch>
                   </pic:blipFill>
                   <pic:spPr>
-                    <a:xfrm>
+                    <a:xfrm rot="0" flipH="0" flipV="0">
                       <a:off x="0" y="0"/>
                       <a:ext cx="3995912" cy="3006824"/>
                     </a:xfrm>
@@ -1069,7 +2228,7 @@
       </w:pPr>
       <w:r>
         <w:drawing>
-          <wp:inline wp14:editId="6D4627B7" wp14:anchorId="389AD175">
+          <wp:inline wp14:editId="6CD94EF0" wp14:anchorId="389AD175">
             <wp:extent cx="4517462" cy="2451179"/>
             <wp:effectExtent l="0" t="0" r="0" b="0"/>
             <wp:docPr id="276812764" name="" title=""/>
@@ -1084,10 +2243,10 @@
                     <pic:cNvPicPr/>
                   </pic:nvPicPr>
                   <pic:blipFill>
-                    <a:blip r:embed="R8e7529328b0d4305">
-                      <a:extLst>
+                    <a:blip r:embed="R96dfa14c01d94674">
+                      <a:extLst xmlns:a="http://schemas.openxmlformats.org/drawingml/2006/main">
                         <a:ext xmlns:a="http://schemas.openxmlformats.org/drawingml/2006/main" uri="{28A0092B-C50C-407E-A947-70E740481C1C}">
-                          <a14:useLocalDpi val="0"/>
+                          <a14:useLocalDpi xmlns:a14="http://schemas.microsoft.com/office/drawing/2010/main" val="0"/>
                         </a:ext>
                       </a:extLst>
                     </a:blip>
@@ -1096,7 +2255,7 @@
                     </a:stretch>
                   </pic:blipFill>
                   <pic:spPr>
-                    <a:xfrm>
+                    <a:xfrm rot="0" flipH="0" flipV="0">
                       <a:off x="0" y="0"/>
                       <a:ext cx="4517462" cy="2451179"/>
                     </a:xfrm>
@@ -1119,23 +2278,111 @@
       </w:pPr>
       <w:r>
         <w:rPr/>
-        <w:t xml:space="preserve">With </w:t>
-      </w:r>
-      <w:r>
-        <w:rPr/>
-        <w:t>small problem</w:t>
-      </w:r>
-      <w:r>
-        <w:rPr/>
-        <w:t xml:space="preserve"> size, quicksort </w:t>
-      </w:r>
-      <w:r>
-        <w:rPr/>
-        <w:t>seems to be</w:t>
-      </w:r>
-      <w:r>
-        <w:rPr/>
-        <w:t xml:space="preserve"> faster, but as the problem size increases, </w:t>
+        <w:t>With</w:t>
+      </w:r>
+      <w:r>
+        <w:rPr/>
+        <w:t xml:space="preserve"> </w:t>
+      </w:r>
+      <w:r>
+        <w:rPr/>
+        <w:t>small</w:t>
+      </w:r>
+      <w:r>
+        <w:rPr/>
+        <w:t xml:space="preserve"> </w:t>
+      </w:r>
+      <w:r>
+        <w:rPr/>
+        <w:t>problem</w:t>
+      </w:r>
+      <w:r>
+        <w:rPr/>
+        <w:t xml:space="preserve"> </w:t>
+      </w:r>
+      <w:r>
+        <w:rPr/>
+        <w:t>size</w:t>
+      </w:r>
+      <w:r>
+        <w:rPr/>
+        <w:t xml:space="preserve">, </w:t>
+      </w:r>
+      <w:r>
+        <w:rPr/>
+        <w:t>quicksort</w:t>
+      </w:r>
+      <w:r>
+        <w:rPr/>
+        <w:t xml:space="preserve"> </w:t>
+      </w:r>
+      <w:r>
+        <w:rPr/>
+        <w:t>seems</w:t>
+      </w:r>
+      <w:r>
+        <w:rPr/>
+        <w:t xml:space="preserve"> </w:t>
+      </w:r>
+      <w:r>
+        <w:rPr/>
+        <w:t>to</w:t>
+      </w:r>
+      <w:r>
+        <w:rPr/>
+        <w:t xml:space="preserve"> be</w:t>
+      </w:r>
+      <w:r>
+        <w:rPr/>
+        <w:t xml:space="preserve"> </w:t>
+      </w:r>
+      <w:r>
+        <w:rPr/>
+        <w:t>faster</w:t>
+      </w:r>
+      <w:r>
+        <w:rPr/>
+        <w:t xml:space="preserve">, </w:t>
+      </w:r>
+      <w:r>
+        <w:rPr/>
+        <w:t>but</w:t>
+      </w:r>
+      <w:r>
+        <w:rPr/>
+        <w:t xml:space="preserve"> as </w:t>
+      </w:r>
+      <w:r>
+        <w:rPr/>
+        <w:t>the</w:t>
+      </w:r>
+      <w:r>
+        <w:rPr/>
+        <w:t xml:space="preserve"> </w:t>
+      </w:r>
+      <w:r>
+        <w:rPr/>
+        <w:t>problem</w:t>
+      </w:r>
+      <w:r>
+        <w:rPr/>
+        <w:t xml:space="preserve"> </w:t>
+      </w:r>
+      <w:r>
+        <w:rPr/>
+        <w:t>size</w:t>
+      </w:r>
+      <w:r>
+        <w:rPr/>
+        <w:t xml:space="preserve"> </w:t>
+      </w:r>
+      <w:r>
+        <w:rPr/>
+        <w:t>increases</w:t>
+      </w:r>
+      <w:r>
+        <w:rPr/>
+        <w:t xml:space="preserve">, </w:t>
       </w:r>
       <w:r>
         <w:rPr/>
@@ -1155,11 +2402,23 @@
       </w:r>
       <w:r>
         <w:rPr/>
-        <w:t xml:space="preserve"> executing at </w:t>
-      </w:r>
-      <w:r>
-        <w:rPr/>
-        <w:t>a good</w:t>
+        <w:t xml:space="preserve"> </w:t>
+      </w:r>
+      <w:r>
+        <w:rPr/>
+        <w:t>executing</w:t>
+      </w:r>
+      <w:r>
+        <w:rPr/>
+        <w:t xml:space="preserve"> at </w:t>
+      </w:r>
+      <w:r>
+        <w:rPr/>
+        <w:t xml:space="preserve">a </w:t>
+      </w:r>
+      <w:r>
+        <w:rPr/>
+        <w:t>good</w:t>
       </w:r>
       <w:r>
         <w:rPr/>
@@ -1167,7 +2426,39 @@
       </w:r>
       <w:r>
         <w:rPr/>
-        <w:t xml:space="preserve">, being even faster than </w:t>
+        <w:t xml:space="preserve">, </w:t>
+      </w:r>
+      <w:r>
+        <w:rPr/>
+        <w:t>being</w:t>
+      </w:r>
+      <w:r>
+        <w:rPr/>
+        <w:t xml:space="preserve"> </w:t>
+      </w:r>
+      <w:r>
+        <w:rPr/>
+        <w:t>even</w:t>
+      </w:r>
+      <w:r>
+        <w:rPr/>
+        <w:t xml:space="preserve"> </w:t>
+      </w:r>
+      <w:r>
+        <w:rPr/>
+        <w:t>faster</w:t>
+      </w:r>
+      <w:r>
+        <w:rPr/>
+        <w:t xml:space="preserve"> </w:t>
+      </w:r>
+      <w:r>
+        <w:rPr/>
+        <w:t>than</w:t>
+      </w:r>
+      <w:r>
+        <w:rPr/>
+        <w:t xml:space="preserve"> </w:t>
       </w:r>
       <w:r>
         <w:rPr/>
@@ -5221,20 +6512,22 @@
     <w:lsdException w:name="List Table 7 Colorful Accent 6" w:uiPriority="52"/>
   </w:latentStyles>
   <w:style w:type="paragraph" w:styleId="Normal" w:default="1">
+    <w:uiPriority w:val="0"/>
     <w:name w:val="Normal"/>
     <w:qFormat/>
-    <w:rsid w:val="00E7167D"/>
-    <w:pPr>
-      <w:spacing w:after="0" w:line="360" w:lineRule="auto"/>
-      <w:jc w:val="both"/>
-    </w:pPr>
+    <w:rsid w:val="5BC7D5D7"/>
     <w:rPr>
-      <w:rFonts w:ascii="Calibri" w:hAnsi="Calibri" w:cs="Times New Roman"/>
+      <w:rFonts w:cs="Times New Roman"/>
+      <w:noProof w:val="0"/>
       <w:color w:val="333333"/>
       <w:sz w:val="24"/>
       <w:szCs w:val="24"/>
-      <w:lang w:eastAsia="es-ES"/>
+      <w:lang w:val="en-US" w:eastAsia="es-ES"/>
     </w:rPr>
+    <w:pPr>
+      <w:spacing w:after="0"/>
+      <w:jc w:val="both"/>
+    </w:pPr>
   </w:style>
   <w:style w:type="paragraph" w:styleId="Ttulo1">
     <w:name w:val="heading 1"/>
@@ -5257,25 +6550,25 @@
     </w:rPr>
   </w:style>
   <w:style w:type="paragraph" w:styleId="Ttulo2">
+    <w:uiPriority w:val="99"/>
     <w:name w:val="heading 2"/>
     <w:basedOn w:val="Normal"/>
     <w:next w:val="Normal"/>
+    <w:semiHidden/>
     <w:link w:val="Ttulo2Car"/>
-    <w:uiPriority w:val="99"/>
-    <w:semiHidden/>
-    <w:rsid w:val="00507E5B"/>
+    <w:rsid w:val="5BC7D5D7"/>
+    <w:rPr>
+      <w:rFonts w:ascii="Calibri Light" w:hAnsi="Calibri Light" w:eastAsia="" w:asciiTheme="majorAscii" w:hAnsiTheme="majorAscii" w:eastAsiaTheme="majorEastAsia" w:cstheme="majorBidi"/>
+      <w:color w:val="2E74B5" w:themeColor="accent1" w:themeTint="FF" w:themeShade="BF"/>
+      <w:sz w:val="26"/>
+      <w:szCs w:val="26"/>
+    </w:rPr>
     <w:pPr>
-      <w:keepNext/>
-      <w:keepLines/>
+      <w:keepNext w:val="1"/>
+      <w:keepLines w:val="1"/>
       <w:spacing w:before="40"/>
       <w:outlineLvl w:val="1"/>
     </w:pPr>
-    <w:rPr>
-      <w:rFonts w:asciiTheme="majorHAnsi" w:hAnsiTheme="majorHAnsi" w:eastAsiaTheme="majorEastAsia" w:cstheme="majorBidi"/>
-      <w:color w:val="2E74B5" w:themeColor="accent1" w:themeShade="BF"/>
-      <w:sz w:val="26"/>
-      <w:szCs w:val="26"/>
-    </w:rPr>
   </w:style>
   <w:style w:type="character" w:styleId="Fuentedeprrafopredeter" w:default="1">
     <w:name w:val="Default Paragraph Font"/>
@@ -5304,46 +6597,43 @@
     <w:semiHidden/>
     <w:unhideWhenUsed/>
   </w:style>
-  <w:style w:type="paragraph" w:styleId="PiedepginaSecciones" w:customStyle="1">
+  <w:style w:type="paragraph" w:styleId="PiedepginaSecciones" w:customStyle="true">
+    <w:uiPriority w:val="19"/>
     <w:name w:val="Pie de página_Secciones"/>
     <w:basedOn w:val="Normal"/>
-    <w:uiPriority w:val="19"/>
     <w:qFormat/>
-    <w:rsid w:val="00525591"/>
-    <w:pPr>
-      <w:tabs>
-        <w:tab w:val="right" w:pos="8220"/>
-      </w:tabs>
-      <w:spacing w:after="100" w:line="240" w:lineRule="auto"/>
-      <w:jc w:val="right"/>
-    </w:pPr>
+    <w:rsid w:val="5BC7D5D7"/>
     <w:rPr>
       <w:rFonts w:cs="UnitOT-Light"/>
-      <w:bCs/>
       <w:noProof/>
       <w:color w:val="0098CD"/>
       <w:sz w:val="20"/>
       <w:szCs w:val="20"/>
     </w:rPr>
+    <w:pPr>
+      <w:tabs>
+        <w:tab w:val="right" w:leader="none" w:pos="8220"/>
+      </w:tabs>
+      <w:spacing w:after="100"/>
+      <w:jc w:val="right"/>
+    </w:pPr>
   </w:style>
-  <w:style w:type="paragraph" w:styleId="PiedepginaAsignatura" w:customStyle="1">
+  <w:style w:type="paragraph" w:styleId="PiedepginaAsignatura" w:customStyle="true">
+    <w:uiPriority w:val="18"/>
     <w:name w:val="Pie de página_Asignatura"/>
     <w:basedOn w:val="Normal"/>
-    <w:uiPriority w:val="18"/>
     <w:qFormat/>
-    <w:rsid w:val="00525591"/>
-    <w:pPr>
-      <w:spacing w:line="276" w:lineRule="auto"/>
-      <w:ind w:firstLine="3686"/>
-      <w:jc w:val="right"/>
-    </w:pPr>
+    <w:rsid w:val="5BC7D5D7"/>
     <w:rPr>
       <w:rFonts w:cs="UnitOT-Light"/>
-      <w:bCs/>
       <w:color w:val="777777"/>
       <w:sz w:val="20"/>
       <w:szCs w:val="20"/>
     </w:rPr>
+    <w:pPr>
+      <w:ind w:firstLine="3686"/>
+      <w:jc w:val="right"/>
+    </w:pPr>
   </w:style>
   <w:style w:type="paragraph" w:styleId="PiedepginaUNIRc" w:customStyle="1">
     <w:name w:val="Pie de página_UNIR(c)"/>
@@ -5385,15 +6675,15 @@
       <w:u w:val="single"/>
     </w:rPr>
   </w:style>
-  <w:style w:type="paragraph" w:styleId="Notaalpie" w:customStyle="1">
+  <w:style w:type="paragraph" w:styleId="Notaalpie" w:customStyle="true">
+    <w:uiPriority w:val="21"/>
     <w:name w:val="Nota al pie"/>
     <w:basedOn w:val="Normal"/>
-    <w:uiPriority w:val="21"/>
     <w:qFormat/>
-    <w:rsid w:val="00002FE1"/>
+    <w:rsid w:val="5BC7D5D7"/>
     <w:rPr>
       <w:sz w:val="16"/>
-      <w:szCs w:val="14"/>
+      <w:szCs w:val="16"/>
     </w:rPr>
   </w:style>
   <w:style w:type="numbering" w:styleId="VietasUNIR" w:customStyle="1">
@@ -5408,25 +6698,24 @@
       </w:numPr>
     </w:pPr>
   </w:style>
-  <w:style w:type="paragraph" w:styleId="Piedefoto-tabla" w:customStyle="1">
+  <w:style w:type="paragraph" w:styleId="Piedefoto-tabla" w:customStyle="true">
+    <w:uiPriority w:val="16"/>
     <w:name w:val="Pie de foto-tabla"/>
     <w:basedOn w:val="Normal"/>
     <w:next w:val="Normal"/>
-    <w:uiPriority w:val="16"/>
     <w:qFormat/>
-    <w:rsid w:val="0041334B"/>
+    <w:rsid w:val="5BC7D5D7"/>
+    <w:rPr>
+      <w:rFonts w:cs="UnitOT-Light"/>
+      <w:color w:val="595959" w:themeColor="text1" w:themeTint="A6" w:themeShade="FF"/>
+      <w:sz w:val="19"/>
+      <w:szCs w:val="19"/>
+    </w:rPr>
     <w:pPr>
-      <w:spacing w:before="120" w:line="276" w:lineRule="auto"/>
+      <w:spacing w:before="120"/>
       <w:ind w:left="-113" w:right="-215"/>
       <w:jc w:val="center"/>
     </w:pPr>
-    <w:rPr>
-      <w:rFonts w:cs="UnitOT-Light"/>
-      <w:iCs/>
-      <w:color w:val="595959" w:themeColor="text1" w:themeTint="A6"/>
-      <w:sz w:val="19"/>
-      <w:szCs w:val="18"/>
-    </w:rPr>
   </w:style>
   <w:style w:type="character" w:styleId="Ttulo1Car" w:customStyle="1">
     <w:name w:val="Título 1 Car"/>
@@ -5443,13 +6732,14 @@
     </w:rPr>
   </w:style>
   <w:style w:type="paragraph" w:styleId="Prrafodelista">
+    <w:uiPriority w:val="98"/>
     <w:name w:val="List Paragraph"/>
     <w:basedOn w:val="Normal"/>
     <w:link w:val="PrrafodelistaCar"/>
-    <w:uiPriority w:val="98"/>
     <w:qFormat/>
-    <w:rsid w:val="00CF1CAE"/>
+    <w:rsid w:val="5BC7D5D7"/>
     <w:pPr>
+      <w:spacing/>
       <w:ind w:left="720"/>
       <w:contextualSpacing/>
     </w:pPr>
@@ -5469,41 +6759,39 @@
       <w:lang w:eastAsia="es-ES"/>
     </w:rPr>
   </w:style>
-  <w:style w:type="paragraph" w:styleId="Citas" w:customStyle="1">
+  <w:style w:type="paragraph" w:styleId="Citas" w:customStyle="true">
+    <w:uiPriority w:val="15"/>
     <w:name w:val="Citas"/>
     <w:basedOn w:val="Normal"/>
     <w:next w:val="Normal"/>
-    <w:uiPriority w:val="15"/>
     <w:qFormat/>
-    <w:rsid w:val="00CF1CAE"/>
+    <w:rsid w:val="5BC7D5D7"/>
+    <w:rPr>
+      <w:rFonts w:cs="UnitOT-Light"/>
+    </w:rPr>
     <w:pPr>
-      <w:spacing w:line="240" w:lineRule="auto"/>
       <w:ind w:left="851"/>
     </w:pPr>
-    <w:rPr>
-      <w:rFonts w:cs="UnitOT-Light"/>
-      <w:szCs w:val="22"/>
-    </w:rPr>
   </w:style>
   <w:style w:type="paragraph" w:styleId="Descripcin">
+    <w:uiPriority w:val="35"/>
     <w:name w:val="caption"/>
     <w:basedOn w:val="Normal"/>
     <w:next w:val="Normal"/>
-    <w:uiPriority w:val="35"/>
     <w:semiHidden/>
     <w:unhideWhenUsed/>
     <w:qFormat/>
-    <w:rsid w:val="00507E5B"/>
-    <w:pPr>
-      <w:spacing w:after="200" w:line="240" w:lineRule="auto"/>
-    </w:pPr>
+    <w:rsid w:val="5BC7D5D7"/>
     <w:rPr>
-      <w:i/>
-      <w:iCs/>
-      <w:color w:val="44546A" w:themeColor="text2"/>
+      <w:i w:val="1"/>
+      <w:iCs w:val="1"/>
+      <w:color w:val="44546A" w:themeColor="text2" w:themeTint="FF" w:themeShade="FF"/>
       <w:sz w:val="18"/>
       <w:szCs w:val="18"/>
     </w:rPr>
+    <w:pPr>
+      <w:spacing w:after="200"/>
+    </w:pPr>
   </w:style>
   <w:style w:type="table" w:styleId="Tablaconcuadrcula">
     <w:name w:val="Table Grid"/>
@@ -5528,39 +6816,37 @@
       </w:tblBorders>
     </w:tblPr>
   </w:style>
-  <w:style w:type="paragraph" w:styleId="TtuloAsignatura" w:customStyle="1">
+  <w:style w:type="paragraph" w:styleId="TtuloAsignatura" w:customStyle="true">
+    <w:uiPriority w:val="2"/>
     <w:name w:val="Título Asignatura"/>
     <w:basedOn w:val="Normal"/>
-    <w:uiPriority w:val="2"/>
     <w:qFormat/>
-    <w:rsid w:val="00E144E3"/>
-    <w:pPr>
-      <w:spacing w:line="276" w:lineRule="auto"/>
-      <w:jc w:val="right"/>
-    </w:pPr>
+    <w:rsid w:val="5BC7D5D7"/>
     <w:rPr>
       <w:rFonts w:ascii="Calibri Light" w:hAnsi="Calibri Light"/>
       <w:color w:val="777777"/>
       <w:sz w:val="40"/>
       <w:szCs w:val="40"/>
     </w:rPr>
+    <w:pPr>
+      <w:jc w:val="right"/>
+    </w:pPr>
   </w:style>
-  <w:style w:type="paragraph" w:styleId="TtuloTema" w:customStyle="1">
+  <w:style w:type="paragraph" w:styleId="TtuloTema" w:customStyle="true">
+    <w:uiPriority w:val="3"/>
     <w:name w:val="Título Tema"/>
     <w:basedOn w:val="Normal"/>
-    <w:uiPriority w:val="3"/>
     <w:qFormat/>
-    <w:rsid w:val="00E144E3"/>
-    <w:pPr>
-      <w:spacing w:line="240" w:lineRule="auto"/>
-      <w:jc w:val="right"/>
-    </w:pPr>
+    <w:rsid w:val="5BC7D5D7"/>
     <w:rPr>
       <w:rFonts w:ascii="Calibri Light" w:hAnsi="Calibri Light"/>
       <w:color w:val="0098CD"/>
       <w:sz w:val="84"/>
       <w:szCs w:val="84"/>
     </w:rPr>
+    <w:pPr>
+      <w:jc w:val="right"/>
+    </w:pPr>
   </w:style>
   <w:style w:type="paragraph" w:styleId="Seccinndice" w:customStyle="1">
     <w:name w:val="Sección Índice"/>
@@ -5576,18 +6862,13 @@
       <w:outlineLvl w:val="9"/>
     </w:pPr>
   </w:style>
-  <w:style w:type="paragraph" w:styleId="SeccionesNivel" w:customStyle="1">
+  <w:style w:type="paragraph" w:styleId="SeccionesNivel" w:customStyle="true">
+    <w:uiPriority w:val="5"/>
     <w:name w:val="Secciones Nivel"/>
     <w:basedOn w:val="Normal"/>
     <w:next w:val="Normal"/>
-    <w:uiPriority w:val="5"/>
     <w:qFormat/>
-    <w:rsid w:val="00525591"/>
-    <w:pPr>
-      <w:spacing w:after="360"/>
-      <w:jc w:val="right"/>
-      <w:outlineLvl w:val="0"/>
-    </w:pPr>
+    <w:rsid w:val="5BC7D5D7"/>
     <w:rPr>
       <w:rFonts w:ascii="Calibri Light" w:hAnsi="Calibri Light" w:cs="Arial"/>
       <w:noProof/>
@@ -5595,6 +6876,11 @@
       <w:sz w:val="56"/>
       <w:szCs w:val="56"/>
     </w:rPr>
+    <w:pPr>
+      <w:spacing w:after="360"/>
+      <w:jc w:val="right"/>
+      <w:outlineLvl w:val="0"/>
+    </w:pPr>
   </w:style>
   <w:style w:type="paragraph" w:styleId="TituloApartado1" w:customStyle="1">
     <w:name w:val="Titulo Apartado 1"/>
@@ -5631,29 +6917,30 @@
       <w:szCs w:val="22"/>
     </w:rPr>
   </w:style>
-  <w:style w:type="paragraph" w:styleId="TtuloApartado2" w:customStyle="1">
+  <w:style w:type="paragraph" w:styleId="TtuloApartado2" w:customStyle="true">
+    <w:uiPriority w:val="8"/>
     <w:name w:val="Título Apartado 2"/>
     <w:basedOn w:val="Normal"/>
     <w:next w:val="Normal"/>
-    <w:uiPriority w:val="8"/>
     <w:qFormat/>
-    <w:rsid w:val="001B7F82"/>
+    <w:rsid w:val="5BC7D5D7"/>
     <w:rPr>
       <w:color w:val="0098CD"/>
       <w:sz w:val="28"/>
-      <w:szCs w:val="26"/>
+      <w:szCs w:val="28"/>
     </w:rPr>
   </w:style>
-  <w:style w:type="paragraph" w:styleId="TtuloApartado3" w:customStyle="1">
+  <w:style w:type="paragraph" w:styleId="TtuloApartado3" w:customStyle="true">
+    <w:uiPriority w:val="9"/>
     <w:name w:val="Título Apartado 3"/>
     <w:basedOn w:val="Normal"/>
     <w:next w:val="Normal"/>
-    <w:uiPriority w:val="9"/>
     <w:qFormat/>
-    <w:rsid w:val="004E5487"/>
+    <w:rsid w:val="5BC7D5D7"/>
     <w:rPr>
       <w:rFonts w:cs="UnitOT-Medi"/>
-      <w:b/>
+      <w:b w:val="1"/>
+      <w:bCs w:val="1"/>
     </w:rPr>
   </w:style>
   <w:style w:type="numbering" w:styleId="NmeracinTest" w:customStyle="1">
@@ -5666,85 +6953,71 @@
       </w:numPr>
     </w:pPr>
   </w:style>
-  <w:style w:type="paragraph" w:styleId="CuadroCmoestudiaryReferencias" w:customStyle="1">
+  <w:style w:type="paragraph" w:styleId="CuadroCmoestudiaryReferencias" w:customStyle="true">
+    <w:uiPriority w:val="10"/>
     <w:name w:val="Cuadro «Cómo estudiar» y Referencias"/>
     <w:basedOn w:val="Normal"/>
-    <w:uiPriority w:val="10"/>
     <w:qFormat/>
-    <w:rsid w:val="001B7F82"/>
+    <w:rsid w:val="5BC7D5D7"/>
+    <w:rPr>
+      <w:rFonts w:cs="UnitOT-Light"/>
+    </w:rPr>
     <w:pPr>
-      <w:pBdr>
-        <w:top w:val="single" w:color="0098CD" w:sz="4" w:space="4"/>
-        <w:bottom w:val="single" w:color="0098CD" w:sz="4" w:space="1"/>
-      </w:pBdr>
-      <w:shd w:val="clear" w:color="auto" w:fill="E6F4F9"/>
       <w:tabs>
-        <w:tab w:val="left" w:pos="1134"/>
+        <w:tab w:val="left" w:leader="none" w:pos="1134"/>
       </w:tabs>
     </w:pPr>
+  </w:style>
+  <w:style w:type="paragraph" w:styleId="Cuadroenlace" w:customStyle="true">
+    <w:uiPriority w:val="11"/>
+    <w:name w:val="Cuadro enlace"/>
+    <w:basedOn w:val="Normal"/>
+    <w:qFormat/>
+    <w:rsid w:val="5BC7D5D7"/>
     <w:rPr>
       <w:rFonts w:cs="UnitOT-Light"/>
-      <w:spacing w:val="-4"/>
-      <w:szCs w:val="22"/>
     </w:rPr>
-  </w:style>
-  <w:style w:type="paragraph" w:styleId="Cuadroenlace" w:customStyle="1">
-    <w:name w:val="Cuadro enlace"/>
-    <w:basedOn w:val="Normal"/>
-    <w:uiPriority w:val="11"/>
-    <w:qFormat/>
-    <w:rsid w:val="00F65B6D"/>
     <w:pPr>
-      <w:pBdr>
-        <w:top w:val="single" w:color="0098CD" w:sz="4" w:space="4"/>
-        <w:bottom w:val="single" w:color="0098CD" w:sz="4" w:space="0"/>
-      </w:pBdr>
       <w:jc w:val="center"/>
     </w:pPr>
-    <w:rPr>
-      <w:rFonts w:cs="UnitOT-Light"/>
-      <w:szCs w:val="22"/>
-    </w:rPr>
   </w:style>
   <w:style w:type="paragraph" w:styleId="TDC1">
+    <w:uiPriority w:val="39"/>
     <w:name w:val="toc 1"/>
     <w:basedOn w:val="Normal"/>
     <w:next w:val="Normal"/>
-    <w:autoRedefine/>
-    <w:uiPriority w:val="39"/>
     <w:unhideWhenUsed/>
-    <w:rsid w:val="001E38BB"/>
+    <w:rsid w:val="5BC7D5D7"/>
+    <w:rPr>
+      <w:noProof/>
+      <w:color w:val="008FBE"/>
+    </w:rPr>
     <w:pPr>
       <w:tabs>
-        <w:tab w:val="right" w:pos="5810"/>
+        <w:tab w:val="right" w:leader="none" w:pos="5810"/>
       </w:tabs>
       <w:spacing w:before="120"/>
       <w:ind w:left="284"/>
       <w:jc w:val="left"/>
     </w:pPr>
-    <w:rPr>
-      <w:noProof/>
-      <w:color w:val="008FBE"/>
-    </w:rPr>
   </w:style>
   <w:style w:type="paragraph" w:styleId="TDC2">
+    <w:uiPriority w:val="39"/>
     <w:name w:val="toc 2"/>
     <w:basedOn w:val="Normal"/>
     <w:next w:val="Normal"/>
-    <w:autoRedefine/>
-    <w:uiPriority w:val="39"/>
     <w:unhideWhenUsed/>
-    <w:rsid w:val="001E38BB"/>
+    <w:rsid w:val="5BC7D5D7"/>
+    <w:rPr>
+      <w:noProof/>
+    </w:rPr>
     <w:pPr>
       <w:tabs>
-        <w:tab w:val="right" w:pos="5952"/>
+        <w:tab w:val="right" w:leader="none" w:pos="5952"/>
       </w:tabs>
       <w:ind w:left="567"/>
       <w:jc w:val="left"/>
     </w:pPr>
-    <w:rPr>
-      <w:noProof/>
-    </w:rPr>
   </w:style>
   <w:style w:type="paragraph" w:styleId="TtuloApartado1sinnivel" w:customStyle="1">
     <w:name w:val="Título Apartado 1_sin nivel"/>
@@ -5960,21 +7233,19 @@
       </w:tcPr>
     </w:tblStylePr>
   </w:style>
-  <w:style w:type="paragraph" w:styleId="Ejemplos" w:customStyle="1">
+  <w:style w:type="paragraph" w:styleId="Ejemplos" w:customStyle="true">
+    <w:uiPriority w:val="22"/>
     <w:name w:val="Ejemplos"/>
     <w:basedOn w:val="Normal"/>
-    <w:uiPriority w:val="22"/>
     <w:qFormat/>
-    <w:rsid w:val="00CF1CAE"/>
+    <w:rsid w:val="5BC7D5D7"/>
+    <w:rPr>
+      <w:rFonts w:cs="UnitOT-Light"/>
+      <w:color w:val="595959" w:themeColor="text1" w:themeTint="A6" w:themeShade="FF"/>
+    </w:rPr>
     <w:pPr>
-      <w:spacing w:line="276" w:lineRule="auto"/>
       <w:ind w:left="284" w:right="284"/>
     </w:pPr>
-    <w:rPr>
-      <w:rFonts w:cs="UnitOT-Light"/>
-      <w:color w:val="595959" w:themeColor="text1" w:themeTint="A6"/>
-      <w:szCs w:val="22"/>
-    </w:rPr>
   </w:style>
   <w:style w:type="table" w:styleId="TablaejemplosUNIR" w:customStyle="1">
     <w:name w:val="Tabla ejemplos UNIR"/>
@@ -6010,18 +7281,17 @@
     </w:pPr>
   </w:style>
   <w:style w:type="paragraph" w:styleId="Encabezado">
+    <w:uiPriority w:val="99"/>
     <w:name w:val="header"/>
     <w:basedOn w:val="Normal"/>
     <w:link w:val="EncabezadoCar"/>
-    <w:uiPriority w:val="99"/>
     <w:qFormat/>
-    <w:rsid w:val="00D30434"/>
+    <w:rsid w:val="5BC7D5D7"/>
     <w:pPr>
       <w:tabs>
-        <w:tab w:val="center" w:pos="4252"/>
-        <w:tab w:val="right" w:pos="8504"/>
+        <w:tab w:val="center" w:leader="none" w:pos="4252"/>
+        <w:tab w:val="right" w:leader="none" w:pos="8504"/>
       </w:tabs>
-      <w:spacing w:line="240" w:lineRule="auto"/>
     </w:pPr>
   </w:style>
   <w:style w:type="character" w:styleId="EncabezadoCar" w:customStyle="1">
@@ -6038,19 +7308,18 @@
     </w:rPr>
   </w:style>
   <w:style w:type="paragraph" w:styleId="Piedepgina">
+    <w:uiPriority w:val="24"/>
     <w:name w:val="footer"/>
     <w:basedOn w:val="Normal"/>
+    <w:unhideWhenUsed/>
     <w:link w:val="PiedepginaCar"/>
-    <w:uiPriority w:val="24"/>
-    <w:unhideWhenUsed/>
     <w:qFormat/>
-    <w:rsid w:val="00E7167D"/>
+    <w:rsid w:val="5BC7D5D7"/>
     <w:pPr>
       <w:tabs>
-        <w:tab w:val="center" w:pos="4252"/>
-        <w:tab w:val="right" w:pos="8504"/>
+        <w:tab w:val="center" w:leader="none" w:pos="4252"/>
+        <w:tab w:val="right" w:leader="none" w:pos="8504"/>
       </w:tabs>
-      <w:spacing w:line="240" w:lineRule="auto"/>
     </w:pPr>
   </w:style>
   <w:style w:type="character" w:styleId="PiedepginaCar" w:customStyle="1">
@@ -6068,16 +7337,13 @@
     </w:rPr>
   </w:style>
   <w:style w:type="paragraph" w:styleId="Textodeglobo">
+    <w:uiPriority w:val="99"/>
     <w:name w:val="Balloon Text"/>
     <w:basedOn w:val="Normal"/>
-    <w:link w:val="TextodegloboCar"/>
-    <w:uiPriority w:val="99"/>
     <w:semiHidden/>
     <w:unhideWhenUsed/>
-    <w:rsid w:val="00C446B8"/>
-    <w:pPr>
-      <w:spacing w:line="240" w:lineRule="auto"/>
-    </w:pPr>
+    <w:link w:val="TextodegloboCar"/>
+    <w:rsid w:val="5BC7D5D7"/>
     <w:rPr>
       <w:rFonts w:ascii="Segoe UI" w:hAnsi="Segoe UI" w:cs="Segoe UI"/>
       <w:sz w:val="18"/>
@@ -6124,16 +7390,13 @@
     </w:tblPr>
   </w:style>
   <w:style w:type="paragraph" w:styleId="Textocomentario">
+    <w:uiPriority w:val="99"/>
     <w:name w:val="annotation text"/>
     <w:basedOn w:val="Normal"/>
-    <w:link w:val="TextocomentarioCar"/>
-    <w:uiPriority w:val="99"/>
     <w:semiHidden/>
     <w:unhideWhenUsed/>
-    <w:rsid w:val="009400C5"/>
-    <w:pPr>
-      <w:spacing w:line="240" w:lineRule="auto"/>
-    </w:pPr>
+    <w:link w:val="TextocomentarioCar"/>
+    <w:rsid w:val="5BC7D5D7"/>
     <w:rPr>
       <w:sz w:val="20"/>
       <w:szCs w:val="20"/>
@@ -6276,6 +7539,335 @@
       <w:sz w:val="24"/>
       <w:szCs w:val="24"/>
       <w:lang w:eastAsia="es-ES"/>
+    </w:rPr>
+  </w:style>
+  <w:style w:type="paragraph" w:styleId="Heading3">
+    <w:uiPriority w:val="9"/>
+    <w:name w:val="heading 3"/>
+    <w:basedOn w:val="Normal"/>
+    <w:next w:val="Normal"/>
+    <w:unhideWhenUsed/>
+    <w:link w:val="Heading3Char"/>
+    <w:qFormat/>
+    <w:rsid w:val="5BC7D5D7"/>
+    <w:rPr>
+      <w:rFonts w:ascii="Calibri Light" w:hAnsi="Calibri Light" w:eastAsia="" w:asciiTheme="majorAscii" w:hAnsiTheme="majorAscii" w:eastAsiaTheme="majorEastAsia" w:cstheme="majorBidi"/>
+      <w:color w:val="1F4D78"/>
+    </w:rPr>
+    <w:pPr>
+      <w:keepNext w:val="1"/>
+      <w:keepLines w:val="1"/>
+      <w:spacing w:before="40"/>
+      <w:outlineLvl w:val="2"/>
+    </w:pPr>
+  </w:style>
+  <w:style w:type="paragraph" w:styleId="Heading4">
+    <w:uiPriority w:val="9"/>
+    <w:name w:val="heading 4"/>
+    <w:basedOn w:val="Normal"/>
+    <w:next w:val="Normal"/>
+    <w:unhideWhenUsed/>
+    <w:link w:val="Heading4Char"/>
+    <w:qFormat/>
+    <w:rsid w:val="5BC7D5D7"/>
+    <w:rPr>
+      <w:rFonts w:ascii="Calibri Light" w:hAnsi="Calibri Light" w:eastAsia="" w:asciiTheme="majorAscii" w:hAnsiTheme="majorAscii" w:eastAsiaTheme="majorEastAsia" w:cstheme="majorBidi"/>
+      <w:i w:val="1"/>
+      <w:iCs w:val="1"/>
+      <w:color w:val="2E74B5" w:themeColor="accent1" w:themeTint="FF" w:themeShade="BF"/>
+    </w:rPr>
+    <w:pPr>
+      <w:keepNext w:val="1"/>
+      <w:keepLines w:val="1"/>
+      <w:spacing w:before="40"/>
+      <w:outlineLvl w:val="3"/>
+    </w:pPr>
+  </w:style>
+  <w:style w:type="paragraph" w:styleId="Heading5">
+    <w:uiPriority w:val="9"/>
+    <w:name w:val="heading 5"/>
+    <w:basedOn w:val="Normal"/>
+    <w:next w:val="Normal"/>
+    <w:unhideWhenUsed/>
+    <w:link w:val="Heading5Char"/>
+    <w:qFormat/>
+    <w:rsid w:val="5BC7D5D7"/>
+    <w:rPr>
+      <w:rFonts w:ascii="Calibri Light" w:hAnsi="Calibri Light" w:eastAsia="" w:asciiTheme="majorAscii" w:hAnsiTheme="majorAscii" w:eastAsiaTheme="majorEastAsia" w:cstheme="majorBidi"/>
+      <w:color w:val="2E74B5" w:themeColor="accent1" w:themeTint="FF" w:themeShade="BF"/>
+    </w:rPr>
+    <w:pPr>
+      <w:keepNext w:val="1"/>
+      <w:keepLines w:val="1"/>
+      <w:spacing w:before="40"/>
+      <w:outlineLvl w:val="4"/>
+    </w:pPr>
+  </w:style>
+  <w:style w:type="paragraph" w:styleId="Heading6">
+    <w:uiPriority w:val="9"/>
+    <w:name w:val="heading 6"/>
+    <w:basedOn w:val="Normal"/>
+    <w:next w:val="Normal"/>
+    <w:unhideWhenUsed/>
+    <w:link w:val="Heading6Char"/>
+    <w:qFormat/>
+    <w:rsid w:val="5BC7D5D7"/>
+    <w:rPr>
+      <w:rFonts w:ascii="Calibri Light" w:hAnsi="Calibri Light" w:eastAsia="" w:asciiTheme="majorAscii" w:hAnsiTheme="majorAscii" w:eastAsiaTheme="majorEastAsia" w:cstheme="majorBidi"/>
+      <w:color w:val="1F4D78"/>
+    </w:rPr>
+    <w:pPr>
+      <w:keepNext w:val="1"/>
+      <w:keepLines w:val="1"/>
+      <w:spacing w:before="40"/>
+      <w:outlineLvl w:val="5"/>
+    </w:pPr>
+  </w:style>
+  <w:style w:type="paragraph" w:styleId="Heading7">
+    <w:uiPriority w:val="9"/>
+    <w:name w:val="heading 7"/>
+    <w:basedOn w:val="Normal"/>
+    <w:next w:val="Normal"/>
+    <w:unhideWhenUsed/>
+    <w:link w:val="Heading7Char"/>
+    <w:qFormat/>
+    <w:rsid w:val="5BC7D5D7"/>
+    <w:rPr>
+      <w:rFonts w:ascii="Calibri Light" w:hAnsi="Calibri Light" w:eastAsia="" w:asciiTheme="majorAscii" w:hAnsiTheme="majorAscii" w:eastAsiaTheme="majorEastAsia" w:cstheme="majorBidi"/>
+      <w:i w:val="1"/>
+      <w:iCs w:val="1"/>
+      <w:color w:val="1F4D78"/>
+    </w:rPr>
+    <w:pPr>
+      <w:keepNext w:val="1"/>
+      <w:keepLines w:val="1"/>
+      <w:spacing w:before="40"/>
+      <w:outlineLvl w:val="6"/>
+    </w:pPr>
+  </w:style>
+  <w:style w:type="paragraph" w:styleId="Heading8">
+    <w:uiPriority w:val="9"/>
+    <w:name w:val="heading 8"/>
+    <w:basedOn w:val="Normal"/>
+    <w:next w:val="Normal"/>
+    <w:unhideWhenUsed/>
+    <w:link w:val="Heading8Char"/>
+    <w:qFormat/>
+    <w:rsid w:val="5BC7D5D7"/>
+    <w:rPr>
+      <w:rFonts w:ascii="Calibri Light" w:hAnsi="Calibri Light" w:eastAsia="" w:asciiTheme="majorAscii" w:hAnsiTheme="majorAscii" w:eastAsiaTheme="majorEastAsia" w:cstheme="majorBidi"/>
+      <w:color w:val="272727"/>
+      <w:sz w:val="21"/>
+      <w:szCs w:val="21"/>
+    </w:rPr>
+    <w:pPr>
+      <w:keepNext w:val="1"/>
+      <w:keepLines w:val="1"/>
+      <w:spacing w:before="40"/>
+      <w:outlineLvl w:val="7"/>
+    </w:pPr>
+  </w:style>
+  <w:style w:type="paragraph" w:styleId="Heading9">
+    <w:uiPriority w:val="9"/>
+    <w:name w:val="heading 9"/>
+    <w:basedOn w:val="Normal"/>
+    <w:next w:val="Normal"/>
+    <w:unhideWhenUsed/>
+    <w:link w:val="Heading9Char"/>
+    <w:qFormat/>
+    <w:rsid w:val="5BC7D5D7"/>
+    <w:rPr>
+      <w:rFonts w:ascii="Calibri Light" w:hAnsi="Calibri Light" w:eastAsia="" w:asciiTheme="majorAscii" w:hAnsiTheme="majorAscii" w:eastAsiaTheme="majorEastAsia" w:cstheme="majorBidi"/>
+      <w:i w:val="1"/>
+      <w:iCs w:val="1"/>
+      <w:color w:val="272727"/>
+      <w:sz w:val="21"/>
+      <w:szCs w:val="21"/>
+    </w:rPr>
+    <w:pPr>
+      <w:keepNext w:val="1"/>
+      <w:keepLines w:val="1"/>
+      <w:spacing w:before="40"/>
+      <w:outlineLvl w:val="8"/>
+    </w:pPr>
+  </w:style>
+  <w:style w:type="paragraph" w:styleId="Title">
+    <w:uiPriority w:val="10"/>
+    <w:name w:val="Title"/>
+    <w:basedOn w:val="Normal"/>
+    <w:next w:val="Normal"/>
+    <w:link w:val="TitleChar"/>
+    <w:qFormat/>
+    <w:rsid w:val="5BC7D5D7"/>
+    <w:rPr>
+      <w:rFonts w:ascii="Calibri Light" w:hAnsi="Calibri Light" w:eastAsia="" w:asciiTheme="majorAscii" w:hAnsiTheme="majorAscii" w:eastAsiaTheme="majorEastAsia" w:cstheme="majorBidi"/>
+      <w:sz w:val="56"/>
+      <w:szCs w:val="56"/>
+    </w:rPr>
+    <w:pPr>
+      <w:spacing/>
+      <w:contextualSpacing/>
+    </w:pPr>
+  </w:style>
+  <w:style w:type="paragraph" w:styleId="Subtitle">
+    <w:uiPriority w:val="11"/>
+    <w:name w:val="Subtitle"/>
+    <w:basedOn w:val="Normal"/>
+    <w:next w:val="Normal"/>
+    <w:link w:val="SubtitleChar"/>
+    <w:qFormat/>
+    <w:rsid w:val="5BC7D5D7"/>
+    <w:rPr>
+      <w:rFonts w:eastAsia="" w:eastAsiaTheme="minorEastAsia"/>
+      <w:color w:val="5A5A5A"/>
+    </w:rPr>
+  </w:style>
+  <w:style w:type="paragraph" w:styleId="Quote">
+    <w:uiPriority w:val="29"/>
+    <w:name w:val="Quote"/>
+    <w:basedOn w:val="Normal"/>
+    <w:next w:val="Normal"/>
+    <w:link w:val="QuoteChar"/>
+    <w:qFormat/>
+    <w:rsid w:val="5BC7D5D7"/>
+    <w:rPr>
+      <w:i w:val="1"/>
+      <w:iCs w:val="1"/>
+      <w:color w:val="404040" w:themeColor="text1" w:themeTint="BF" w:themeShade="FF"/>
+    </w:rPr>
+    <w:pPr>
+      <w:spacing w:before="200"/>
+      <w:ind w:left="864" w:right="864"/>
+      <w:jc w:val="center"/>
+    </w:pPr>
+  </w:style>
+  <w:style w:type="paragraph" w:styleId="IntenseQuote">
+    <w:uiPriority w:val="30"/>
+    <w:name w:val="Intense Quote"/>
+    <w:basedOn w:val="Normal"/>
+    <w:next w:val="Normal"/>
+    <w:link w:val="IntenseQuoteChar"/>
+    <w:qFormat/>
+    <w:rsid w:val="5BC7D5D7"/>
+    <w:rPr>
+      <w:i w:val="1"/>
+      <w:iCs w:val="1"/>
+      <w:color w:val="5B9BD5" w:themeColor="accent1" w:themeTint="FF" w:themeShade="FF"/>
+    </w:rPr>
+    <w:pPr>
+      <w:spacing w:before="360" w:after="360"/>
+      <w:ind w:left="864" w:right="864"/>
+      <w:jc w:val="center"/>
+    </w:pPr>
+  </w:style>
+  <w:style w:type="paragraph" w:styleId="TOC3">
+    <w:uiPriority w:val="39"/>
+    <w:name w:val="toc 3"/>
+    <w:basedOn w:val="Normal"/>
+    <w:next w:val="Normal"/>
+    <w:unhideWhenUsed/>
+    <w:rsid w:val="5BC7D5D7"/>
+    <w:pPr>
+      <w:spacing w:after="100"/>
+      <w:ind w:left="440"/>
+    </w:pPr>
+  </w:style>
+  <w:style w:type="paragraph" w:styleId="TOC4">
+    <w:uiPriority w:val="39"/>
+    <w:name w:val="toc 4"/>
+    <w:basedOn w:val="Normal"/>
+    <w:next w:val="Normal"/>
+    <w:unhideWhenUsed/>
+    <w:rsid w:val="5BC7D5D7"/>
+    <w:pPr>
+      <w:spacing w:after="100"/>
+      <w:ind w:left="660"/>
+    </w:pPr>
+  </w:style>
+  <w:style w:type="paragraph" w:styleId="TOC5">
+    <w:uiPriority w:val="39"/>
+    <w:name w:val="toc 5"/>
+    <w:basedOn w:val="Normal"/>
+    <w:next w:val="Normal"/>
+    <w:unhideWhenUsed/>
+    <w:rsid w:val="5BC7D5D7"/>
+    <w:pPr>
+      <w:spacing w:after="100"/>
+      <w:ind w:left="880"/>
+    </w:pPr>
+  </w:style>
+  <w:style w:type="paragraph" w:styleId="TOC6">
+    <w:uiPriority w:val="39"/>
+    <w:name w:val="toc 6"/>
+    <w:basedOn w:val="Normal"/>
+    <w:next w:val="Normal"/>
+    <w:unhideWhenUsed/>
+    <w:rsid w:val="5BC7D5D7"/>
+    <w:pPr>
+      <w:spacing w:after="100"/>
+      <w:ind w:left="1100"/>
+    </w:pPr>
+  </w:style>
+  <w:style w:type="paragraph" w:styleId="TOC7">
+    <w:uiPriority w:val="39"/>
+    <w:name w:val="toc 7"/>
+    <w:basedOn w:val="Normal"/>
+    <w:next w:val="Normal"/>
+    <w:unhideWhenUsed/>
+    <w:rsid w:val="5BC7D5D7"/>
+    <w:pPr>
+      <w:spacing w:after="100"/>
+      <w:ind w:left="1320"/>
+    </w:pPr>
+  </w:style>
+  <w:style w:type="paragraph" w:styleId="TOC8">
+    <w:uiPriority w:val="39"/>
+    <w:name w:val="toc 8"/>
+    <w:basedOn w:val="Normal"/>
+    <w:next w:val="Normal"/>
+    <w:unhideWhenUsed/>
+    <w:rsid w:val="5BC7D5D7"/>
+    <w:pPr>
+      <w:spacing w:after="100"/>
+      <w:ind w:left="1540"/>
+    </w:pPr>
+  </w:style>
+  <w:style w:type="paragraph" w:styleId="TOC9">
+    <w:uiPriority w:val="39"/>
+    <w:name w:val="toc 9"/>
+    <w:basedOn w:val="Normal"/>
+    <w:next w:val="Normal"/>
+    <w:unhideWhenUsed/>
+    <w:rsid w:val="5BC7D5D7"/>
+    <w:pPr>
+      <w:spacing w:after="100"/>
+      <w:ind w:left="1760"/>
+    </w:pPr>
+  </w:style>
+  <w:style w:type="paragraph" w:styleId="EndnoteText">
+    <w:uiPriority w:val="99"/>
+    <w:name w:val="endnote text"/>
+    <w:basedOn w:val="Normal"/>
+    <w:semiHidden/>
+    <w:unhideWhenUsed/>
+    <w:link w:val="EndnoteTextChar"/>
+    <w:rsid w:val="5BC7D5D7"/>
+    <w:rPr>
+      <w:sz w:val="20"/>
+      <w:szCs w:val="20"/>
+    </w:rPr>
+  </w:style>
+  <w:style w:type="paragraph" w:styleId="FootnoteText">
+    <w:uiPriority w:val="99"/>
+    <w:name w:val="footnote text"/>
+    <w:basedOn w:val="Normal"/>
+    <w:semiHidden/>
+    <w:unhideWhenUsed/>
+    <w:link w:val="FootnoteTextChar"/>
+    <w:rsid w:val="5BC7D5D7"/>
+    <w:rPr>
+      <w:sz w:val="20"/>
+      <w:szCs w:val="20"/>
     </w:rPr>
   </w:style>
 </w:styles>

</xml_diff>